<commit_message>
working on week 11
</commit_message>
<xml_diff>
--- a/TechComm/assignments/user-doc/detailed_user_doc_rubric.docx
+++ b/TechComm/assignments/user-doc/detailed_user_doc_rubric.docx
@@ -30,7 +30,13 @@
     </w:p>
     <w:p>
       <w:r>
-        <w:t>Revised January 23, 2026</w:t>
+        <w:t xml:space="preserve">Revised </w:t>
+      </w:r>
+      <w:r>
+        <w:t>March 16</w:t>
+      </w:r>
+      <w:r>
+        <w:t>, 2026</w:t>
       </w:r>
     </w:p>
     <w:tbl>
@@ -41,29 +47,26 @@
         <w:tblLook w:val="04A0" w:firstRow="1" w:lastRow="0" w:firstColumn="1" w:lastColumn="0" w:noHBand="0" w:noVBand="1"/>
       </w:tblPr>
       <w:tblGrid>
-        <w:gridCol w:w="1972"/>
-        <w:gridCol w:w="1892"/>
-        <w:gridCol w:w="701"/>
-        <w:gridCol w:w="1606"/>
-        <w:gridCol w:w="1418"/>
-        <w:gridCol w:w="2413"/>
-        <w:gridCol w:w="1576"/>
-        <w:gridCol w:w="1389"/>
-        <w:gridCol w:w="1991"/>
-        <w:gridCol w:w="1606"/>
-        <w:gridCol w:w="1418"/>
-        <w:gridCol w:w="2029"/>
-        <w:gridCol w:w="1606"/>
-        <w:gridCol w:w="1418"/>
-        <w:gridCol w:w="2029"/>
-        <w:gridCol w:w="1606"/>
-        <w:gridCol w:w="1418"/>
-        <w:gridCol w:w="2029"/>
+        <w:gridCol w:w="1989"/>
+        <w:gridCol w:w="2012"/>
+        <w:gridCol w:w="713"/>
+        <w:gridCol w:w="1537"/>
+        <w:gridCol w:w="1393"/>
+        <w:gridCol w:w="1981"/>
+        <w:gridCol w:w="1563"/>
+        <w:gridCol w:w="1403"/>
+        <w:gridCol w:w="2015"/>
+        <w:gridCol w:w="1564"/>
+        <w:gridCol w:w="1515"/>
+        <w:gridCol w:w="2014"/>
+        <w:gridCol w:w="1565"/>
+        <w:gridCol w:w="1363"/>
+        <w:gridCol w:w="2046"/>
       </w:tblGrid>
       <w:tr>
         <w:tc>
           <w:tcPr>
-            <w:tcW w:w="1972" w:type="dxa"/>
+            <w:tcW w:w="1989" w:type="dxa"/>
           </w:tcPr>
           <w:p>
             <w:pPr>
@@ -74,17 +77,14 @@
             <w:r>
               <w:rPr>
                 <w:rFonts w:asciiTheme="majorHAnsi" w:hAnsiTheme="majorHAnsi" w:cstheme="majorHAnsi"/>
-                <w:b/>
-                <w:bCs/>
-                <w:color w:val="0070C0"/>
-              </w:rPr>
-              <w:t>title_or_outcome_id</w:t>
+              </w:rPr>
+              <w:t>Project Topic &amp; Audience</w:t>
             </w:r>
           </w:p>
         </w:tc>
         <w:tc>
           <w:tcPr>
-            <w:tcW w:w="1892" w:type="dxa"/>
+            <w:tcW w:w="2012" w:type="dxa"/>
           </w:tcPr>
           <w:p>
             <w:pPr>
@@ -96,13 +96,13 @@
               <w:rPr>
                 <w:rFonts w:asciiTheme="majorHAnsi" w:hAnsiTheme="majorHAnsi" w:cstheme="majorHAnsi"/>
               </w:rPr>
-              <w:t>Description</w:t>
+              <w:t>Meets basic assignment requirements for the topic and audience.</w:t>
             </w:r>
           </w:p>
         </w:tc>
         <w:tc>
           <w:tcPr>
-            <w:tcW w:w="701" w:type="dxa"/>
+            <w:tcW w:w="713" w:type="dxa"/>
           </w:tcPr>
           <w:p>
             <w:pPr>
@@ -113,16 +113,14 @@
             <w:r>
               <w:rPr>
                 <w:rFonts w:asciiTheme="majorHAnsi" w:hAnsiTheme="majorHAnsi" w:cstheme="majorHAnsi"/>
-                <w:b/>
-                <w:bCs/>
-              </w:rPr>
-              <w:t>User range</w:t>
+              </w:rPr>
+              <w:t>False</w:t>
             </w:r>
           </w:p>
         </w:tc>
         <w:tc>
           <w:tcPr>
-            <w:tcW w:w="1606" w:type="dxa"/>
+            <w:tcW w:w="1537" w:type="dxa"/>
           </w:tcPr>
           <w:p>
             <w:pPr>
@@ -133,17 +131,14 @@
             <w:r>
               <w:rPr>
                 <w:rFonts w:asciiTheme="majorHAnsi" w:hAnsiTheme="majorHAnsi" w:cstheme="majorHAnsi"/>
-                <w:b/>
-                <w:bCs/>
-                <w:color w:val="0070C0"/>
-              </w:rPr>
-              <w:t>Rating_points_1</w:t>
+              </w:rPr>
+              <w:t>10</w:t>
             </w:r>
           </w:p>
         </w:tc>
         <w:tc>
           <w:tcPr>
-            <w:tcW w:w="1418" w:type="dxa"/>
+            <w:tcW w:w="1393" w:type="dxa"/>
           </w:tcPr>
           <w:p>
             <w:pPr>
@@ -158,15 +153,14 @@
                 <w:rFonts w:asciiTheme="majorHAnsi" w:hAnsiTheme="majorHAnsi" w:cstheme="majorHAnsi"/>
                 <w:b/>
                 <w:bCs/>
-                <w:color w:val="0070C0"/>
-              </w:rPr>
-              <w:t>Rating_title_1</w:t>
+              </w:rPr>
+              <w:t>Meets Expectations</w:t>
             </w:r>
           </w:p>
         </w:tc>
         <w:tc>
           <w:tcPr>
-            <w:tcW w:w="2413" w:type="dxa"/>
+            <w:tcW w:w="1981" w:type="dxa"/>
           </w:tcPr>
           <w:p>
             <w:pPr>
@@ -177,17 +171,26 @@
             <w:r>
               <w:rPr>
                 <w:rFonts w:asciiTheme="majorHAnsi" w:hAnsiTheme="majorHAnsi" w:cstheme="majorHAnsi"/>
-                <w:b/>
-                <w:bCs/>
-                <w:color w:val="0070C0"/>
-              </w:rPr>
-              <w:t>Rating_description_1</w:t>
+              </w:rPr>
+              <w:t>Topic is related to the subject of the informational report. Instructions address a real user need</w:t>
+            </w:r>
+            <w:r>
+              <w:rPr>
+                <w:rFonts w:asciiTheme="majorHAnsi" w:hAnsiTheme="majorHAnsi" w:cstheme="majorHAnsi"/>
+              </w:rPr>
+              <w:t xml:space="preserve"> and </w:t>
+            </w:r>
+            <w:r>
+              <w:rPr>
+                <w:rFonts w:asciiTheme="majorHAnsi" w:hAnsiTheme="majorHAnsi" w:cstheme="majorHAnsi"/>
+              </w:rPr>
+              <w:t>are written for non-expert users from a specific local community or group.</w:t>
             </w:r>
           </w:p>
         </w:tc>
         <w:tc>
           <w:tcPr>
-            <w:tcW w:w="1576" w:type="dxa"/>
+            <w:tcW w:w="1563" w:type="dxa"/>
           </w:tcPr>
           <w:p>
             <w:pPr>
@@ -199,31 +202,35 @@
               <w:rPr>
                 <w:rFonts w:asciiTheme="majorHAnsi" w:hAnsiTheme="majorHAnsi" w:cstheme="majorHAnsi"/>
               </w:rPr>
-              <w:t>Rating_points_2</w:t>
+              <w:t>8</w:t>
             </w:r>
           </w:p>
         </w:tc>
         <w:tc>
           <w:tcPr>
-            <w:tcW w:w="1389" w:type="dxa"/>
+            <w:tcW w:w="1403" w:type="dxa"/>
           </w:tcPr>
           <w:p>
             <w:pPr>
               <w:rPr>
                 <w:rFonts w:asciiTheme="majorHAnsi" w:hAnsiTheme="majorHAnsi" w:cstheme="majorHAnsi"/>
+                <w:b/>
+                <w:bCs/>
               </w:rPr>
             </w:pPr>
             <w:r>
               <w:rPr>
                 <w:rFonts w:asciiTheme="majorHAnsi" w:hAnsiTheme="majorHAnsi" w:cstheme="majorHAnsi"/>
-              </w:rPr>
-              <w:t>Rating_title_2</w:t>
+                <w:b/>
+                <w:bCs/>
+              </w:rPr>
+              <w:t>Almost There</w:t>
             </w:r>
           </w:p>
         </w:tc>
         <w:tc>
           <w:tcPr>
-            <w:tcW w:w="1991" w:type="dxa"/>
+            <w:tcW w:w="2015" w:type="dxa"/>
           </w:tcPr>
           <w:p>
             <w:pPr>
@@ -235,13 +242,13 @@
               <w:rPr>
                 <w:rFonts w:asciiTheme="majorHAnsi" w:hAnsiTheme="majorHAnsi" w:cstheme="majorHAnsi"/>
               </w:rPr>
-              <w:t>Rating_description_2</w:t>
+              <w:t>Does not meet one of the four requirements.</w:t>
             </w:r>
           </w:p>
         </w:tc>
         <w:tc>
           <w:tcPr>
-            <w:tcW w:w="1606" w:type="dxa"/>
+            <w:tcW w:w="1564" w:type="dxa"/>
           </w:tcPr>
           <w:p>
             <w:pPr>
@@ -252,47 +259,36 @@
             <w:r>
               <w:rPr>
                 <w:rFonts w:asciiTheme="majorHAnsi" w:hAnsiTheme="majorHAnsi" w:cstheme="majorHAnsi"/>
-                <w:b/>
-                <w:bCs/>
-                <w:color w:val="0070C0"/>
-              </w:rPr>
-              <w:t>Rating_points_</w:t>
-            </w:r>
-            <w:r>
-              <w:rPr>
-                <w:rFonts w:asciiTheme="majorHAnsi" w:hAnsiTheme="majorHAnsi" w:cstheme="majorHAnsi"/>
-                <w:b/>
-                <w:bCs/>
-                <w:color w:val="0070C0"/>
-              </w:rPr>
-              <w:t>3</w:t>
+              </w:rPr>
+              <w:t>5</w:t>
             </w:r>
           </w:p>
         </w:tc>
         <w:tc>
           <w:tcPr>
-            <w:tcW w:w="1418" w:type="dxa"/>
+            <w:tcW w:w="1515" w:type="dxa"/>
           </w:tcPr>
           <w:p>
             <w:pPr>
               <w:rPr>
                 <w:rFonts w:asciiTheme="majorHAnsi" w:hAnsiTheme="majorHAnsi" w:cstheme="majorHAnsi"/>
-              </w:rPr>
-            </w:pPr>
-            <w:r>
-              <w:rPr>
-                <w:rFonts w:asciiTheme="majorHAnsi" w:hAnsiTheme="majorHAnsi" w:cstheme="majorHAnsi"/>
                 <w:b/>
                 <w:bCs/>
-                <w:color w:val="0070C0"/>
-              </w:rPr>
-              <w:t>Rating_title_3</w:t>
+              </w:rPr>
+            </w:pPr>
+            <w:r>
+              <w:rPr>
+                <w:rFonts w:asciiTheme="majorHAnsi" w:hAnsiTheme="majorHAnsi" w:cstheme="majorHAnsi"/>
+                <w:b/>
+                <w:bCs/>
+              </w:rPr>
+              <w:t>Needs Work</w:t>
             </w:r>
           </w:p>
         </w:tc>
         <w:tc>
           <w:tcPr>
-            <w:tcW w:w="2029" w:type="dxa"/>
+            <w:tcW w:w="2014" w:type="dxa"/>
           </w:tcPr>
           <w:p>
             <w:pPr>
@@ -305,15 +301,14 @@
                 <w:rFonts w:asciiTheme="majorHAnsi" w:hAnsiTheme="majorHAnsi" w:cstheme="majorHAnsi"/>
                 <w:b/>
                 <w:bCs/>
-                <w:color w:val="0070C0"/>
-              </w:rPr>
-              <w:t>Rating_description_3</w:t>
+              </w:rPr>
+              <w:t>Does not meet two of the four requirements.</w:t>
             </w:r>
           </w:p>
         </w:tc>
         <w:tc>
           <w:tcPr>
-            <w:tcW w:w="1606" w:type="dxa"/>
+            <w:tcW w:w="1565" w:type="dxa"/>
           </w:tcPr>
           <w:p>
             <w:pPr>
@@ -324,17 +319,14 @@
             <w:r>
               <w:rPr>
                 <w:rFonts w:asciiTheme="majorHAnsi" w:hAnsiTheme="majorHAnsi" w:cstheme="majorHAnsi"/>
-                <w:b/>
-                <w:bCs/>
-                <w:color w:val="0070C0"/>
-              </w:rPr>
-              <w:t>Rating_points_4</w:t>
+              </w:rPr>
+              <w:t>0</w:t>
             </w:r>
           </w:p>
         </w:tc>
         <w:tc>
           <w:tcPr>
-            <w:tcW w:w="1418" w:type="dxa"/>
+            <w:tcW w:w="1363" w:type="dxa"/>
           </w:tcPr>
           <w:p>
             <w:pPr>
@@ -349,15 +341,14 @@
                 <w:rFonts w:asciiTheme="majorHAnsi" w:hAnsiTheme="majorHAnsi" w:cstheme="majorHAnsi"/>
                 <w:b/>
                 <w:bCs/>
-                <w:color w:val="0070C0"/>
-              </w:rPr>
-              <w:t>Rating_title_4</w:t>
+              </w:rPr>
+              <w:t>Missing</w:t>
             </w:r>
           </w:p>
         </w:tc>
         <w:tc>
           <w:tcPr>
-            <w:tcW w:w="2029" w:type="dxa"/>
+            <w:tcW w:w="2046" w:type="dxa"/>
           </w:tcPr>
           <w:p>
             <w:pPr>
@@ -368,76 +359,8 @@
             <w:r>
               <w:rPr>
                 <w:rFonts w:asciiTheme="majorHAnsi" w:hAnsiTheme="majorHAnsi" w:cstheme="majorHAnsi"/>
-                <w:b/>
-                <w:bCs/>
-                <w:color w:val="0070C0"/>
-              </w:rPr>
-              <w:t>Rating_description_4</w:t>
-            </w:r>
-          </w:p>
-        </w:tc>
-        <w:tc>
-          <w:tcPr>
-            <w:tcW w:w="1606" w:type="dxa"/>
-          </w:tcPr>
-          <w:p>
-            <w:pPr>
-              <w:rPr>
-                <w:rFonts w:asciiTheme="majorHAnsi" w:hAnsiTheme="majorHAnsi" w:cstheme="majorHAnsi"/>
-              </w:rPr>
-            </w:pPr>
-            <w:r>
-              <w:rPr>
-                <w:rFonts w:asciiTheme="majorHAnsi" w:hAnsiTheme="majorHAnsi" w:cstheme="majorHAnsi"/>
-                <w:b/>
-                <w:bCs/>
-                <w:color w:val="0070C0"/>
-              </w:rPr>
-              <w:t>Rating_points_5</w:t>
-            </w:r>
-          </w:p>
-        </w:tc>
-        <w:tc>
-          <w:tcPr>
-            <w:tcW w:w="1418" w:type="dxa"/>
-          </w:tcPr>
-          <w:p>
-            <w:pPr>
-              <w:rPr>
-                <w:rFonts w:asciiTheme="majorHAnsi" w:hAnsiTheme="majorHAnsi" w:cstheme="majorHAnsi"/>
-                <w:b/>
-                <w:bCs/>
-              </w:rPr>
-            </w:pPr>
-            <w:r>
-              <w:rPr>
-                <w:rFonts w:asciiTheme="majorHAnsi" w:hAnsiTheme="majorHAnsi" w:cstheme="majorHAnsi"/>
-                <w:b/>
-                <w:bCs/>
-                <w:color w:val="0070C0"/>
-              </w:rPr>
-              <w:t>Rating_title_5</w:t>
-            </w:r>
-          </w:p>
-        </w:tc>
-        <w:tc>
-          <w:tcPr>
-            <w:tcW w:w="2029" w:type="dxa"/>
-          </w:tcPr>
-          <w:p>
-            <w:pPr>
-              <w:rPr>
-                <w:rFonts w:asciiTheme="majorHAnsi" w:hAnsiTheme="majorHAnsi" w:cstheme="majorHAnsi"/>
-              </w:rPr>
-            </w:pPr>
-            <w:r>
-              <w:rPr>
-                <w:rFonts w:asciiTheme="majorHAnsi" w:hAnsiTheme="majorHAnsi" w:cstheme="majorHAnsi"/>
-                <w:b/>
-                <w:bCs/>
-                <w:color w:val="0070C0"/>
-              </w:rPr>
-              <w:t>Rating_description_5</w:t>
+              </w:rPr>
+              <w:t>Does not meet three or more of the requirements.</w:t>
             </w:r>
           </w:p>
         </w:tc>
@@ -445,7 +368,7 @@
       <w:tr>
         <w:tc>
           <w:tcPr>
-            <w:tcW w:w="1972" w:type="dxa"/>
+            <w:tcW w:w="1989" w:type="dxa"/>
           </w:tcPr>
           <w:p>
             <w:pPr>
@@ -463,7 +386,7 @@
         </w:tc>
         <w:tc>
           <w:tcPr>
-            <w:tcW w:w="1892" w:type="dxa"/>
+            <w:tcW w:w="2012" w:type="dxa"/>
           </w:tcPr>
           <w:p>
             <w:pPr>
@@ -481,7 +404,7 @@
         </w:tc>
         <w:tc>
           <w:tcPr>
-            <w:tcW w:w="701" w:type="dxa"/>
+            <w:tcW w:w="713" w:type="dxa"/>
           </w:tcPr>
           <w:p>
             <w:pPr>
@@ -499,7 +422,7 @@
         </w:tc>
         <w:tc>
           <w:tcPr>
-            <w:tcW w:w="1606" w:type="dxa"/>
+            <w:tcW w:w="1537" w:type="dxa"/>
           </w:tcPr>
           <w:p>
             <w:pPr>
@@ -511,35 +434,33 @@
               <w:rPr>
                 <w:rFonts w:asciiTheme="majorHAnsi" w:hAnsiTheme="majorHAnsi" w:cstheme="majorHAnsi"/>
               </w:rPr>
-              <w:t>12</w:t>
+              <w:t>9</w:t>
             </w:r>
           </w:p>
         </w:tc>
         <w:tc>
           <w:tcPr>
-            <w:tcW w:w="1418" w:type="dxa"/>
+            <w:tcW w:w="1393" w:type="dxa"/>
           </w:tcPr>
           <w:p>
             <w:pPr>
               <w:rPr>
                 <w:rFonts w:asciiTheme="majorHAnsi" w:hAnsiTheme="majorHAnsi" w:cstheme="majorHAnsi"/>
+              </w:rPr>
+            </w:pPr>
+            <w:r>
+              <w:rPr>
+                <w:rFonts w:asciiTheme="majorHAnsi" w:hAnsiTheme="majorHAnsi" w:cstheme="majorHAnsi"/>
                 <w:b/>
                 <w:bCs/>
               </w:rPr>
-            </w:pPr>
-            <w:r>
-              <w:rPr>
-                <w:rFonts w:asciiTheme="majorHAnsi" w:hAnsiTheme="majorHAnsi" w:cstheme="majorHAnsi"/>
-                <w:b/>
-                <w:bCs/>
-              </w:rPr>
-              <w:t>Exceeds Expectations</w:t>
+              <w:t>Meets Expectations</w:t>
             </w:r>
           </w:p>
         </w:tc>
         <w:tc>
           <w:tcPr>
-            <w:tcW w:w="2413" w:type="dxa"/>
+            <w:tcW w:w="1981" w:type="dxa"/>
           </w:tcPr>
           <w:p>
             <w:pPr>
@@ -551,19 +472,19 @@
               <w:rPr>
                 <w:rFonts w:asciiTheme="majorHAnsi" w:hAnsiTheme="majorHAnsi" w:cstheme="majorHAnsi"/>
               </w:rPr>
-              <w:t>Thoroughly explains audience, use, and connection to report topic. Uses memo format flawlessly.</w:t>
-            </w:r>
-            <w:r>
-              <w:rPr>
-                <w:rFonts w:asciiTheme="majorHAnsi" w:hAnsiTheme="majorHAnsi" w:cstheme="majorHAnsi"/>
-              </w:rPr>
-              <w:t xml:space="preserve"> Cover memo placed as first item in the project.</w:t>
+              <w:t>Explains audience and purpose for the user document with clear connection to the report topic. Uses memo format accurately.</w:t>
+            </w:r>
+            <w:r>
+              <w:rPr>
+                <w:rFonts w:asciiTheme="majorHAnsi" w:hAnsiTheme="majorHAnsi" w:cstheme="majorHAnsi"/>
+              </w:rPr>
+              <w:t xml:space="preserve"> Cover memo placed first.</w:t>
             </w:r>
           </w:p>
         </w:tc>
         <w:tc>
           <w:tcPr>
-            <w:tcW w:w="1576" w:type="dxa"/>
+            <w:tcW w:w="1563" w:type="dxa"/>
           </w:tcPr>
           <w:p>
             <w:pPr>
@@ -575,13 +496,13 @@
               <w:rPr>
                 <w:rFonts w:asciiTheme="majorHAnsi" w:hAnsiTheme="majorHAnsi" w:cstheme="majorHAnsi"/>
               </w:rPr>
-              <w:t>10</w:t>
+              <w:t>7</w:t>
             </w:r>
           </w:p>
         </w:tc>
         <w:tc>
           <w:tcPr>
-            <w:tcW w:w="1389" w:type="dxa"/>
+            <w:tcW w:w="1403" w:type="dxa"/>
           </w:tcPr>
           <w:p>
             <w:pPr>
@@ -595,13 +516,13 @@
                 <w:b/>
                 <w:bCs/>
               </w:rPr>
-              <w:t>Meets Expectations</w:t>
+              <w:t>Almost There</w:t>
             </w:r>
           </w:p>
         </w:tc>
         <w:tc>
           <w:tcPr>
-            <w:tcW w:w="1991" w:type="dxa"/>
+            <w:tcW w:w="2015" w:type="dxa"/>
           </w:tcPr>
           <w:p>
             <w:pPr>
@@ -613,19 +534,37 @@
               <w:rPr>
                 <w:rFonts w:asciiTheme="majorHAnsi" w:hAnsiTheme="majorHAnsi" w:cstheme="majorHAnsi"/>
               </w:rPr>
-              <w:t>Explains audience and purpose for the user document with clear connection to the report topic. Uses memo format accurately.</w:t>
-            </w:r>
-            <w:r>
-              <w:rPr>
-                <w:rFonts w:asciiTheme="majorHAnsi" w:hAnsiTheme="majorHAnsi" w:cstheme="majorHAnsi"/>
-              </w:rPr>
-              <w:t xml:space="preserve"> Cover memo placed first.</w:t>
+              <w:t xml:space="preserve">Provides some incomplete or unclear content and/or makes </w:t>
+            </w:r>
+            <w:r>
+              <w:rPr>
+                <w:rFonts w:asciiTheme="majorHAnsi" w:hAnsiTheme="majorHAnsi" w:cstheme="majorHAnsi"/>
+              </w:rPr>
+              <w:t xml:space="preserve">1 or 2 </w:t>
+            </w:r>
+            <w:r>
+              <w:rPr>
+                <w:rFonts w:asciiTheme="majorHAnsi" w:hAnsiTheme="majorHAnsi" w:cstheme="majorHAnsi"/>
+              </w:rPr>
+              <w:t>minor errors in memo format</w:t>
+            </w:r>
+            <w:r>
+              <w:rPr>
+                <w:rFonts w:asciiTheme="majorHAnsi" w:hAnsiTheme="majorHAnsi" w:cstheme="majorHAnsi"/>
+              </w:rPr>
+              <w:t xml:space="preserve"> or placement</w:t>
+            </w:r>
+            <w:r>
+              <w:rPr>
+                <w:rFonts w:asciiTheme="majorHAnsi" w:hAnsiTheme="majorHAnsi" w:cstheme="majorHAnsi"/>
+              </w:rPr>
+              <w:t>.</w:t>
             </w:r>
           </w:p>
         </w:tc>
         <w:tc>
           <w:tcPr>
-            <w:tcW w:w="1606" w:type="dxa"/>
+            <w:tcW w:w="1564" w:type="dxa"/>
           </w:tcPr>
           <w:p>
             <w:pPr>
@@ -637,33 +576,35 @@
               <w:rPr>
                 <w:rFonts w:asciiTheme="majorHAnsi" w:hAnsiTheme="majorHAnsi" w:cstheme="majorHAnsi"/>
               </w:rPr>
-              <w:t>7</w:t>
+              <w:t>5</w:t>
             </w:r>
           </w:p>
         </w:tc>
         <w:tc>
           <w:tcPr>
-            <w:tcW w:w="1418" w:type="dxa"/>
+            <w:tcW w:w="1515" w:type="dxa"/>
           </w:tcPr>
           <w:p>
             <w:pPr>
               <w:rPr>
                 <w:rFonts w:asciiTheme="majorHAnsi" w:hAnsiTheme="majorHAnsi" w:cstheme="majorHAnsi"/>
-              </w:rPr>
-            </w:pPr>
-            <w:r>
-              <w:rPr>
-                <w:rFonts w:asciiTheme="majorHAnsi" w:hAnsiTheme="majorHAnsi" w:cstheme="majorHAnsi"/>
                 <w:b/>
                 <w:bCs/>
               </w:rPr>
-              <w:t>Almost There</w:t>
+            </w:pPr>
+            <w:r>
+              <w:rPr>
+                <w:rFonts w:asciiTheme="majorHAnsi" w:hAnsiTheme="majorHAnsi" w:cstheme="majorHAnsi"/>
+                <w:b/>
+                <w:bCs/>
+              </w:rPr>
+              <w:t>Needs Work</w:t>
             </w:r>
           </w:p>
         </w:tc>
         <w:tc>
           <w:tcPr>
-            <w:tcW w:w="2029" w:type="dxa"/>
+            <w:tcW w:w="2014" w:type="dxa"/>
           </w:tcPr>
           <w:p>
             <w:pPr>
@@ -675,19 +616,7 @@
               <w:rPr>
                 <w:rFonts w:asciiTheme="majorHAnsi" w:hAnsiTheme="majorHAnsi" w:cstheme="majorHAnsi"/>
               </w:rPr>
-              <w:t xml:space="preserve">Provides some incomplete or unclear content and/or makes </w:t>
-            </w:r>
-            <w:r>
-              <w:rPr>
-                <w:rFonts w:asciiTheme="majorHAnsi" w:hAnsiTheme="majorHAnsi" w:cstheme="majorHAnsi"/>
-              </w:rPr>
-              <w:t xml:space="preserve">1 or 2 </w:t>
-            </w:r>
-            <w:r>
-              <w:rPr>
-                <w:rFonts w:asciiTheme="majorHAnsi" w:hAnsiTheme="majorHAnsi" w:cstheme="majorHAnsi"/>
-              </w:rPr>
-              <w:t>minor errors in memo format</w:t>
+              <w:t>Is missing significant information and/or uses incorrect memo format</w:t>
             </w:r>
             <w:r>
               <w:rPr>
@@ -705,7 +634,7 @@
         </w:tc>
         <w:tc>
           <w:tcPr>
-            <w:tcW w:w="1606" w:type="dxa"/>
+            <w:tcW w:w="1565" w:type="dxa"/>
           </w:tcPr>
           <w:p>
             <w:pPr>
@@ -717,13 +646,13 @@
               <w:rPr>
                 <w:rFonts w:asciiTheme="majorHAnsi" w:hAnsiTheme="majorHAnsi" w:cstheme="majorHAnsi"/>
               </w:rPr>
-              <w:t>5</w:t>
+              <w:t>0</w:t>
             </w:r>
           </w:p>
         </w:tc>
         <w:tc>
           <w:tcPr>
-            <w:tcW w:w="1418" w:type="dxa"/>
+            <w:tcW w:w="1363" w:type="dxa"/>
           </w:tcPr>
           <w:p>
             <w:pPr>
@@ -739,83 +668,13 @@
                 <w:b/>
                 <w:bCs/>
               </w:rPr>
-              <w:t>Needs Work</w:t>
+              <w:t>Missing</w:t>
             </w:r>
           </w:p>
         </w:tc>
         <w:tc>
           <w:tcPr>
-            <w:tcW w:w="2029" w:type="dxa"/>
-          </w:tcPr>
-          <w:p>
-            <w:pPr>
-              <w:rPr>
-                <w:rFonts w:asciiTheme="majorHAnsi" w:hAnsiTheme="majorHAnsi" w:cstheme="majorHAnsi"/>
-              </w:rPr>
-            </w:pPr>
-            <w:r>
-              <w:rPr>
-                <w:rFonts w:asciiTheme="majorHAnsi" w:hAnsiTheme="majorHAnsi" w:cstheme="majorHAnsi"/>
-              </w:rPr>
-              <w:t>Is missing significant information and/or uses incorrect memo format</w:t>
-            </w:r>
-            <w:r>
-              <w:rPr>
-                <w:rFonts w:asciiTheme="majorHAnsi" w:hAnsiTheme="majorHAnsi" w:cstheme="majorHAnsi"/>
-              </w:rPr>
-              <w:t xml:space="preserve"> or placement</w:t>
-            </w:r>
-            <w:r>
-              <w:rPr>
-                <w:rFonts w:asciiTheme="majorHAnsi" w:hAnsiTheme="majorHAnsi" w:cstheme="majorHAnsi"/>
-              </w:rPr>
-              <w:t>.</w:t>
-            </w:r>
-          </w:p>
-        </w:tc>
-        <w:tc>
-          <w:tcPr>
-            <w:tcW w:w="1606" w:type="dxa"/>
-          </w:tcPr>
-          <w:p>
-            <w:pPr>
-              <w:rPr>
-                <w:rFonts w:asciiTheme="majorHAnsi" w:hAnsiTheme="majorHAnsi" w:cstheme="majorHAnsi"/>
-              </w:rPr>
-            </w:pPr>
-            <w:r>
-              <w:rPr>
-                <w:rFonts w:asciiTheme="majorHAnsi" w:hAnsiTheme="majorHAnsi" w:cstheme="majorHAnsi"/>
-              </w:rPr>
-              <w:t>0</w:t>
-            </w:r>
-          </w:p>
-        </w:tc>
-        <w:tc>
-          <w:tcPr>
-            <w:tcW w:w="1418" w:type="dxa"/>
-          </w:tcPr>
-          <w:p>
-            <w:pPr>
-              <w:rPr>
-                <w:rFonts w:asciiTheme="majorHAnsi" w:hAnsiTheme="majorHAnsi" w:cstheme="majorHAnsi"/>
-                <w:b/>
-                <w:bCs/>
-              </w:rPr>
-            </w:pPr>
-            <w:r>
-              <w:rPr>
-                <w:rFonts w:asciiTheme="majorHAnsi" w:hAnsiTheme="majorHAnsi" w:cstheme="majorHAnsi"/>
-                <w:b/>
-                <w:bCs/>
-              </w:rPr>
-              <w:t>Missing</w:t>
-            </w:r>
-          </w:p>
-        </w:tc>
-        <w:tc>
-          <w:tcPr>
-            <w:tcW w:w="2029" w:type="dxa"/>
+            <w:tcW w:w="2046" w:type="dxa"/>
           </w:tcPr>
           <w:p>
             <w:pPr>
@@ -835,7 +694,7 @@
       <w:tr>
         <w:tc>
           <w:tcPr>
-            <w:tcW w:w="1972" w:type="dxa"/>
+            <w:tcW w:w="1989" w:type="dxa"/>
           </w:tcPr>
           <w:p>
             <w:pPr>
@@ -853,7 +712,7 @@
         </w:tc>
         <w:tc>
           <w:tcPr>
-            <w:tcW w:w="1892" w:type="dxa"/>
+            <w:tcW w:w="2012" w:type="dxa"/>
           </w:tcPr>
           <w:p>
             <w:pPr>
@@ -871,7 +730,7 @@
         </w:tc>
         <w:tc>
           <w:tcPr>
-            <w:tcW w:w="701" w:type="dxa"/>
+            <w:tcW w:w="713" w:type="dxa"/>
           </w:tcPr>
           <w:p>
             <w:pPr>
@@ -889,7 +748,7 @@
         </w:tc>
         <w:tc>
           <w:tcPr>
-            <w:tcW w:w="1606" w:type="dxa"/>
+            <w:tcW w:w="1537" w:type="dxa"/>
           </w:tcPr>
           <w:p>
             <w:pPr>
@@ -901,13 +760,13 @@
               <w:rPr>
                 <w:rFonts w:asciiTheme="majorHAnsi" w:hAnsiTheme="majorHAnsi" w:cstheme="majorHAnsi"/>
               </w:rPr>
-              <w:t>12</w:t>
+              <w:t>9</w:t>
             </w:r>
           </w:p>
         </w:tc>
         <w:tc>
           <w:tcPr>
-            <w:tcW w:w="1418" w:type="dxa"/>
+            <w:tcW w:w="1393" w:type="dxa"/>
           </w:tcPr>
           <w:p>
             <w:pPr>
@@ -923,13 +782,13 @@
                 <w:b/>
                 <w:bCs/>
               </w:rPr>
-              <w:t>Exceeds Expectations</w:t>
+              <w:t>Meets Expectations</w:t>
             </w:r>
           </w:p>
         </w:tc>
         <w:tc>
           <w:tcPr>
-            <w:tcW w:w="2413" w:type="dxa"/>
+            <w:tcW w:w="1981" w:type="dxa"/>
           </w:tcPr>
           <w:p>
             <w:pPr>
@@ -941,13 +800,13 @@
               <w:rPr>
                 <w:rFonts w:asciiTheme="majorHAnsi" w:hAnsiTheme="majorHAnsi" w:cstheme="majorHAnsi"/>
               </w:rPr>
-              <w:t>Provides clear, accurate title; includes document date; introduces document professionally; and includes useful notices.</w:t>
+              <w:t>Includes all required elements; provides a detailed and complete beginning to the document.</w:t>
             </w:r>
           </w:p>
         </w:tc>
         <w:tc>
           <w:tcPr>
-            <w:tcW w:w="1576" w:type="dxa"/>
+            <w:tcW w:w="1563" w:type="dxa"/>
           </w:tcPr>
           <w:p>
             <w:pPr>
@@ -959,13 +818,13 @@
               <w:rPr>
                 <w:rFonts w:asciiTheme="majorHAnsi" w:hAnsiTheme="majorHAnsi" w:cstheme="majorHAnsi"/>
               </w:rPr>
-              <w:t>10</w:t>
+              <w:t>7</w:t>
             </w:r>
           </w:p>
         </w:tc>
         <w:tc>
           <w:tcPr>
-            <w:tcW w:w="1389" w:type="dxa"/>
+            <w:tcW w:w="1403" w:type="dxa"/>
           </w:tcPr>
           <w:p>
             <w:pPr>
@@ -981,13 +840,13 @@
                 <w:b/>
                 <w:bCs/>
               </w:rPr>
-              <w:t>Meets Expectations</w:t>
+              <w:t>Almost There</w:t>
             </w:r>
           </w:p>
         </w:tc>
         <w:tc>
           <w:tcPr>
-            <w:tcW w:w="1991" w:type="dxa"/>
+            <w:tcW w:w="2015" w:type="dxa"/>
           </w:tcPr>
           <w:p>
             <w:pPr>
@@ -999,13 +858,13 @@
               <w:rPr>
                 <w:rFonts w:asciiTheme="majorHAnsi" w:hAnsiTheme="majorHAnsi" w:cstheme="majorHAnsi"/>
               </w:rPr>
-              <w:t>Includes all required elements; provides a detailed and complete beginning to the document.</w:t>
+              <w:t>Includes all elements, but one is weak, incomplete, or unclear.</w:t>
             </w:r>
           </w:p>
         </w:tc>
         <w:tc>
           <w:tcPr>
-            <w:tcW w:w="1606" w:type="dxa"/>
+            <w:tcW w:w="1564" w:type="dxa"/>
           </w:tcPr>
           <w:p>
             <w:pPr>
@@ -1017,13 +876,13 @@
               <w:rPr>
                 <w:rFonts w:asciiTheme="majorHAnsi" w:hAnsiTheme="majorHAnsi" w:cstheme="majorHAnsi"/>
               </w:rPr>
-              <w:t>7</w:t>
+              <w:t>5</w:t>
             </w:r>
           </w:p>
         </w:tc>
         <w:tc>
           <w:tcPr>
-            <w:tcW w:w="1418" w:type="dxa"/>
+            <w:tcW w:w="1515" w:type="dxa"/>
           </w:tcPr>
           <w:p>
             <w:pPr>
@@ -1039,13 +898,13 @@
                 <w:b/>
                 <w:bCs/>
               </w:rPr>
-              <w:t>Almost There</w:t>
+              <w:t>Needs Work</w:t>
             </w:r>
           </w:p>
         </w:tc>
         <w:tc>
           <w:tcPr>
-            <w:tcW w:w="2029" w:type="dxa"/>
+            <w:tcW w:w="2014" w:type="dxa"/>
           </w:tcPr>
           <w:p>
             <w:pPr>
@@ -1057,13 +916,13 @@
               <w:rPr>
                 <w:rFonts w:asciiTheme="majorHAnsi" w:hAnsiTheme="majorHAnsi" w:cstheme="majorHAnsi"/>
               </w:rPr>
-              <w:t>Includes all elements, but one is weak, incomplete, or unclear.</w:t>
+              <w:t>Missing one or two required elements and/or several elements are incomplete or confusing.</w:t>
             </w:r>
           </w:p>
         </w:tc>
         <w:tc>
           <w:tcPr>
-            <w:tcW w:w="1606" w:type="dxa"/>
+            <w:tcW w:w="1565" w:type="dxa"/>
           </w:tcPr>
           <w:p>
             <w:pPr>
@@ -1075,13 +934,13 @@
               <w:rPr>
                 <w:rFonts w:asciiTheme="majorHAnsi" w:hAnsiTheme="majorHAnsi" w:cstheme="majorHAnsi"/>
               </w:rPr>
-              <w:t>5</w:t>
+              <w:t>0</w:t>
             </w:r>
           </w:p>
         </w:tc>
         <w:tc>
           <w:tcPr>
-            <w:tcW w:w="1418" w:type="dxa"/>
+            <w:tcW w:w="1363" w:type="dxa"/>
           </w:tcPr>
           <w:p>
             <w:pPr>
@@ -1097,71 +956,13 @@
                 <w:b/>
                 <w:bCs/>
               </w:rPr>
-              <w:t>Needs Work</w:t>
+              <w:t>Missing</w:t>
             </w:r>
           </w:p>
         </w:tc>
         <w:tc>
           <w:tcPr>
-            <w:tcW w:w="2029" w:type="dxa"/>
-          </w:tcPr>
-          <w:p>
-            <w:pPr>
-              <w:rPr>
-                <w:rFonts w:asciiTheme="majorHAnsi" w:hAnsiTheme="majorHAnsi" w:cstheme="majorHAnsi"/>
-              </w:rPr>
-            </w:pPr>
-            <w:r>
-              <w:rPr>
-                <w:rFonts w:asciiTheme="majorHAnsi" w:hAnsiTheme="majorHAnsi" w:cstheme="majorHAnsi"/>
-              </w:rPr>
-              <w:t>Missing one or two required elements and/or several elements are incomplete or confusing.</w:t>
-            </w:r>
-          </w:p>
-        </w:tc>
-        <w:tc>
-          <w:tcPr>
-            <w:tcW w:w="1606" w:type="dxa"/>
-          </w:tcPr>
-          <w:p>
-            <w:pPr>
-              <w:rPr>
-                <w:rFonts w:asciiTheme="majorHAnsi" w:hAnsiTheme="majorHAnsi" w:cstheme="majorHAnsi"/>
-              </w:rPr>
-            </w:pPr>
-            <w:r>
-              <w:rPr>
-                <w:rFonts w:asciiTheme="majorHAnsi" w:hAnsiTheme="majorHAnsi" w:cstheme="majorHAnsi"/>
-              </w:rPr>
-              <w:t>0</w:t>
-            </w:r>
-          </w:p>
-        </w:tc>
-        <w:tc>
-          <w:tcPr>
-            <w:tcW w:w="1418" w:type="dxa"/>
-          </w:tcPr>
-          <w:p>
-            <w:pPr>
-              <w:rPr>
-                <w:rFonts w:asciiTheme="majorHAnsi" w:hAnsiTheme="majorHAnsi" w:cstheme="majorHAnsi"/>
-                <w:b/>
-                <w:bCs/>
-              </w:rPr>
-            </w:pPr>
-            <w:r>
-              <w:rPr>
-                <w:rFonts w:asciiTheme="majorHAnsi" w:hAnsiTheme="majorHAnsi" w:cstheme="majorHAnsi"/>
-                <w:b/>
-                <w:bCs/>
-              </w:rPr>
-              <w:t>Missing</w:t>
-            </w:r>
-          </w:p>
-        </w:tc>
-        <w:tc>
-          <w:tcPr>
-            <w:tcW w:w="2029" w:type="dxa"/>
+            <w:tcW w:w="2046" w:type="dxa"/>
           </w:tcPr>
           <w:p>
             <w:pPr>
@@ -1181,7 +982,7 @@
       <w:tr>
         <w:tc>
           <w:tcPr>
-            <w:tcW w:w="1972" w:type="dxa"/>
+            <w:tcW w:w="1989" w:type="dxa"/>
           </w:tcPr>
           <w:p>
             <w:pPr>
@@ -1200,7 +1001,7 @@
         </w:tc>
         <w:tc>
           <w:tcPr>
-            <w:tcW w:w="1892" w:type="dxa"/>
+            <w:tcW w:w="2012" w:type="dxa"/>
           </w:tcPr>
           <w:p>
             <w:pPr>
@@ -1218,7 +1019,7 @@
         </w:tc>
         <w:tc>
           <w:tcPr>
-            <w:tcW w:w="701" w:type="dxa"/>
+            <w:tcW w:w="713" w:type="dxa"/>
           </w:tcPr>
           <w:p>
             <w:pPr>
@@ -1236,7 +1037,7 @@
         </w:tc>
         <w:tc>
           <w:tcPr>
-            <w:tcW w:w="1606" w:type="dxa"/>
+            <w:tcW w:w="1537" w:type="dxa"/>
           </w:tcPr>
           <w:p>
             <w:pPr>
@@ -1248,13 +1049,13 @@
               <w:rPr>
                 <w:rFonts w:asciiTheme="majorHAnsi" w:hAnsiTheme="majorHAnsi" w:cstheme="majorHAnsi"/>
               </w:rPr>
-              <w:t>12</w:t>
+              <w:t>9</w:t>
             </w:r>
           </w:p>
         </w:tc>
         <w:tc>
           <w:tcPr>
-            <w:tcW w:w="1418" w:type="dxa"/>
+            <w:tcW w:w="1393" w:type="dxa"/>
           </w:tcPr>
           <w:p>
             <w:pPr>
@@ -1268,13 +1069,13 @@
                 <w:b/>
                 <w:bCs/>
               </w:rPr>
-              <w:t>Exceeds Expectations</w:t>
+              <w:t>Meets Expectations</w:t>
             </w:r>
           </w:p>
         </w:tc>
         <w:tc>
           <w:tcPr>
-            <w:tcW w:w="2413" w:type="dxa"/>
+            <w:tcW w:w="1981" w:type="dxa"/>
           </w:tcPr>
           <w:p>
             <w:pPr>
@@ -1286,13 +1087,20 @@
               <w:rPr>
                 <w:rFonts w:asciiTheme="majorHAnsi" w:hAnsiTheme="majorHAnsi" w:cstheme="majorHAnsi"/>
               </w:rPr>
-              <w:t>Anticipates all knowledge gaps; provides just-enough theory.</w:t>
+              <w:t xml:space="preserve">Defines all unfamiliar terms and provides relevant </w:t>
+            </w:r>
+            <w:r>
+              <w:rPr>
+                <w:rFonts w:asciiTheme="majorHAnsi" w:hAnsiTheme="majorHAnsi" w:cstheme="majorHAnsi"/>
+              </w:rPr>
+              <w:lastRenderedPageBreak/>
+              <w:t>background information.</w:t>
             </w:r>
           </w:p>
         </w:tc>
         <w:tc>
           <w:tcPr>
-            <w:tcW w:w="1576" w:type="dxa"/>
+            <w:tcW w:w="1563" w:type="dxa"/>
           </w:tcPr>
           <w:p>
             <w:pPr>
@@ -1304,13 +1112,14 @@
               <w:rPr>
                 <w:rFonts w:asciiTheme="majorHAnsi" w:hAnsiTheme="majorHAnsi" w:cstheme="majorHAnsi"/>
               </w:rPr>
-              <w:t>10</w:t>
+              <w:lastRenderedPageBreak/>
+              <w:t>7</w:t>
             </w:r>
           </w:p>
         </w:tc>
         <w:tc>
           <w:tcPr>
-            <w:tcW w:w="1389" w:type="dxa"/>
+            <w:tcW w:w="1403" w:type="dxa"/>
           </w:tcPr>
           <w:p>
             <w:pPr>
@@ -1324,13 +1133,13 @@
                 <w:b/>
                 <w:bCs/>
               </w:rPr>
-              <w:t>Meets Expectations</w:t>
+              <w:t>Almost There</w:t>
             </w:r>
           </w:p>
         </w:tc>
         <w:tc>
           <w:tcPr>
-            <w:tcW w:w="1991" w:type="dxa"/>
+            <w:tcW w:w="2015" w:type="dxa"/>
           </w:tcPr>
           <w:p>
             <w:pPr>
@@ -1342,13 +1151,20 @@
               <w:rPr>
                 <w:rFonts w:asciiTheme="majorHAnsi" w:hAnsiTheme="majorHAnsi" w:cstheme="majorHAnsi"/>
               </w:rPr>
-              <w:t>Defines all unfamiliar terms and provides relevant background information.</w:t>
+              <w:t xml:space="preserve">Defines most unfamiliar terms and provides background but </w:t>
+            </w:r>
+            <w:r>
+              <w:rPr>
+                <w:rFonts w:asciiTheme="majorHAnsi" w:hAnsiTheme="majorHAnsi" w:cstheme="majorHAnsi"/>
+              </w:rPr>
+              <w:lastRenderedPageBreak/>
+              <w:t>misses some details.</w:t>
             </w:r>
           </w:p>
         </w:tc>
         <w:tc>
           <w:tcPr>
-            <w:tcW w:w="1606" w:type="dxa"/>
+            <w:tcW w:w="1564" w:type="dxa"/>
           </w:tcPr>
           <w:p>
             <w:pPr>
@@ -1360,13 +1176,14 @@
               <w:rPr>
                 <w:rFonts w:asciiTheme="majorHAnsi" w:hAnsiTheme="majorHAnsi" w:cstheme="majorHAnsi"/>
               </w:rPr>
-              <w:t>7</w:t>
+              <w:lastRenderedPageBreak/>
+              <w:t>5</w:t>
             </w:r>
           </w:p>
         </w:tc>
         <w:tc>
           <w:tcPr>
-            <w:tcW w:w="1418" w:type="dxa"/>
+            <w:tcW w:w="1515" w:type="dxa"/>
           </w:tcPr>
           <w:p>
             <w:pPr>
@@ -1380,13 +1197,13 @@
                 <w:b/>
                 <w:bCs/>
               </w:rPr>
-              <w:t>Almost There</w:t>
+              <w:t>Needs Work</w:t>
             </w:r>
           </w:p>
         </w:tc>
         <w:tc>
           <w:tcPr>
-            <w:tcW w:w="2029" w:type="dxa"/>
+            <w:tcW w:w="2014" w:type="dxa"/>
           </w:tcPr>
           <w:p>
             <w:pPr>
@@ -1398,25 +1215,20 @@
               <w:rPr>
                 <w:rFonts w:asciiTheme="majorHAnsi" w:hAnsiTheme="majorHAnsi" w:cstheme="majorHAnsi"/>
               </w:rPr>
-              <w:t xml:space="preserve">Defines most unfamiliar terms and provides </w:t>
-            </w:r>
-            <w:r>
-              <w:rPr>
-                <w:rFonts w:asciiTheme="majorHAnsi" w:hAnsiTheme="majorHAnsi" w:cstheme="majorHAnsi"/>
-              </w:rPr>
-              <w:t>background but</w:t>
-            </w:r>
-            <w:r>
-              <w:rPr>
-                <w:rFonts w:asciiTheme="majorHAnsi" w:hAnsiTheme="majorHAnsi" w:cstheme="majorHAnsi"/>
-              </w:rPr>
-              <w:t xml:space="preserve"> misses some details.</w:t>
+              <w:t xml:space="preserve">Uses jargon and undefined terms and/or background </w:t>
+            </w:r>
+            <w:r>
+              <w:rPr>
+                <w:rFonts w:asciiTheme="majorHAnsi" w:hAnsiTheme="majorHAnsi" w:cstheme="majorHAnsi"/>
+              </w:rPr>
+              <w:lastRenderedPageBreak/>
+              <w:t>is incompletely explained.</w:t>
             </w:r>
           </w:p>
         </w:tc>
         <w:tc>
           <w:tcPr>
-            <w:tcW w:w="1606" w:type="dxa"/>
+            <w:tcW w:w="1565" w:type="dxa"/>
           </w:tcPr>
           <w:p>
             <w:pPr>
@@ -1428,13 +1240,14 @@
               <w:rPr>
                 <w:rFonts w:asciiTheme="majorHAnsi" w:hAnsiTheme="majorHAnsi" w:cstheme="majorHAnsi"/>
               </w:rPr>
-              <w:t>5</w:t>
+              <w:lastRenderedPageBreak/>
+              <w:t>0</w:t>
             </w:r>
           </w:p>
         </w:tc>
         <w:tc>
           <w:tcPr>
-            <w:tcW w:w="1418" w:type="dxa"/>
+            <w:tcW w:w="1363" w:type="dxa"/>
           </w:tcPr>
           <w:p>
             <w:pPr>
@@ -1448,13 +1261,13 @@
                 <w:b/>
                 <w:bCs/>
               </w:rPr>
-              <w:t>Needs Work</w:t>
+              <w:t>Missing</w:t>
             </w:r>
           </w:p>
         </w:tc>
         <w:tc>
           <w:tcPr>
-            <w:tcW w:w="2029" w:type="dxa"/>
+            <w:tcW w:w="2046" w:type="dxa"/>
           </w:tcPr>
           <w:p>
             <w:pPr>
@@ -1466,63 +1279,14 @@
               <w:rPr>
                 <w:rFonts w:asciiTheme="majorHAnsi" w:hAnsiTheme="majorHAnsi" w:cstheme="majorHAnsi"/>
               </w:rPr>
-              <w:t>Uses jargon and undefined terms and/or background is incompletely explained.</w:t>
-            </w:r>
-          </w:p>
-        </w:tc>
-        <w:tc>
-          <w:tcPr>
-            <w:tcW w:w="1606" w:type="dxa"/>
-          </w:tcPr>
-          <w:p>
-            <w:pPr>
-              <w:rPr>
-                <w:rFonts w:asciiTheme="majorHAnsi" w:hAnsiTheme="majorHAnsi" w:cstheme="majorHAnsi"/>
-              </w:rPr>
-            </w:pPr>
-            <w:r>
-              <w:rPr>
-                <w:rFonts w:asciiTheme="majorHAnsi" w:hAnsiTheme="majorHAnsi" w:cstheme="majorHAnsi"/>
-              </w:rPr>
-              <w:t>0</w:t>
-            </w:r>
-          </w:p>
-        </w:tc>
-        <w:tc>
-          <w:tcPr>
-            <w:tcW w:w="1418" w:type="dxa"/>
-          </w:tcPr>
-          <w:p>
-            <w:pPr>
-              <w:rPr>
-                <w:rFonts w:asciiTheme="majorHAnsi" w:hAnsiTheme="majorHAnsi" w:cstheme="majorHAnsi"/>
-              </w:rPr>
-            </w:pPr>
-            <w:r>
-              <w:rPr>
-                <w:rFonts w:asciiTheme="majorHAnsi" w:hAnsiTheme="majorHAnsi" w:cstheme="majorHAnsi"/>
-                <w:b/>
-                <w:bCs/>
-              </w:rPr>
-              <w:t>Missing</w:t>
-            </w:r>
-          </w:p>
-        </w:tc>
-        <w:tc>
-          <w:tcPr>
-            <w:tcW w:w="2029" w:type="dxa"/>
-          </w:tcPr>
-          <w:p>
-            <w:pPr>
-              <w:rPr>
-                <w:rFonts w:asciiTheme="majorHAnsi" w:hAnsiTheme="majorHAnsi" w:cstheme="majorHAnsi"/>
-              </w:rPr>
-            </w:pPr>
-            <w:r>
-              <w:rPr>
-                <w:rFonts w:asciiTheme="majorHAnsi" w:hAnsiTheme="majorHAnsi" w:cstheme="majorHAnsi"/>
-              </w:rPr>
-              <w:t>No explanation of terminology; necessary background information missing.</w:t>
+              <w:t xml:space="preserve">No explanation of terminology; necessary background </w:t>
+            </w:r>
+            <w:r>
+              <w:rPr>
+                <w:rFonts w:asciiTheme="majorHAnsi" w:hAnsiTheme="majorHAnsi" w:cstheme="majorHAnsi"/>
+              </w:rPr>
+              <w:lastRenderedPageBreak/>
+              <w:t>information missing.</w:t>
             </w:r>
           </w:p>
         </w:tc>
@@ -1530,7 +1294,7 @@
       <w:tr>
         <w:tc>
           <w:tcPr>
-            <w:tcW w:w="1972" w:type="dxa"/>
+            <w:tcW w:w="1989" w:type="dxa"/>
           </w:tcPr>
           <w:p>
             <w:pPr>
@@ -1542,13 +1306,14 @@
               <w:rPr>
                 <w:rFonts w:asciiTheme="majorHAnsi" w:hAnsiTheme="majorHAnsi" w:cstheme="majorHAnsi"/>
               </w:rPr>
+              <w:lastRenderedPageBreak/>
               <w:t>Equipment &amp; Supplies</w:t>
             </w:r>
           </w:p>
         </w:tc>
         <w:tc>
           <w:tcPr>
-            <w:tcW w:w="1892" w:type="dxa"/>
+            <w:tcW w:w="2012" w:type="dxa"/>
           </w:tcPr>
           <w:p>
             <w:pPr>
@@ -1566,7 +1331,7 @@
         </w:tc>
         <w:tc>
           <w:tcPr>
-            <w:tcW w:w="701" w:type="dxa"/>
+            <w:tcW w:w="713" w:type="dxa"/>
           </w:tcPr>
           <w:p>
             <w:pPr>
@@ -1584,7 +1349,7 @@
         </w:tc>
         <w:tc>
           <w:tcPr>
-            <w:tcW w:w="1606" w:type="dxa"/>
+            <w:tcW w:w="1537" w:type="dxa"/>
           </w:tcPr>
           <w:p>
             <w:pPr>
@@ -1596,13 +1361,13 @@
               <w:rPr>
                 <w:rFonts w:asciiTheme="majorHAnsi" w:hAnsiTheme="majorHAnsi" w:cstheme="majorHAnsi"/>
               </w:rPr>
-              <w:t>12</w:t>
+              <w:t>9</w:t>
             </w:r>
           </w:p>
         </w:tc>
         <w:tc>
           <w:tcPr>
-            <w:tcW w:w="1418" w:type="dxa"/>
+            <w:tcW w:w="1393" w:type="dxa"/>
           </w:tcPr>
           <w:p>
             <w:pPr>
@@ -1616,13 +1381,13 @@
                 <w:b/>
                 <w:bCs/>
               </w:rPr>
-              <w:t>Exceeds Expectations</w:t>
+              <w:t>Meets Expectations</w:t>
             </w:r>
           </w:p>
         </w:tc>
         <w:tc>
           <w:tcPr>
-            <w:tcW w:w="2413" w:type="dxa"/>
+            <w:tcW w:w="1981" w:type="dxa"/>
           </w:tcPr>
           <w:p>
             <w:pPr>
@@ -1634,13 +1399,13 @@
               <w:rPr>
                 <w:rFonts w:asciiTheme="majorHAnsi" w:hAnsiTheme="majorHAnsi" w:cstheme="majorHAnsi"/>
               </w:rPr>
-              <w:t>Provides complete list of tools/materials with helpful specifications/alternatives and visuals as needed.</w:t>
+              <w:t>Provides complete list with necessary specifications.</w:t>
             </w:r>
           </w:p>
         </w:tc>
         <w:tc>
           <w:tcPr>
-            <w:tcW w:w="1576" w:type="dxa"/>
+            <w:tcW w:w="1563" w:type="dxa"/>
           </w:tcPr>
           <w:p>
             <w:pPr>
@@ -1652,13 +1417,13 @@
               <w:rPr>
                 <w:rFonts w:asciiTheme="majorHAnsi" w:hAnsiTheme="majorHAnsi" w:cstheme="majorHAnsi"/>
               </w:rPr>
-              <w:t>10</w:t>
+              <w:t>7</w:t>
             </w:r>
           </w:p>
         </w:tc>
         <w:tc>
           <w:tcPr>
-            <w:tcW w:w="1389" w:type="dxa"/>
+            <w:tcW w:w="1403" w:type="dxa"/>
           </w:tcPr>
           <w:p>
             <w:pPr>
@@ -1672,13 +1437,13 @@
                 <w:b/>
                 <w:bCs/>
               </w:rPr>
-              <w:t>Meets Expectations</w:t>
+              <w:t>Almost There</w:t>
             </w:r>
           </w:p>
         </w:tc>
         <w:tc>
           <w:tcPr>
-            <w:tcW w:w="1991" w:type="dxa"/>
+            <w:tcW w:w="2015" w:type="dxa"/>
           </w:tcPr>
           <w:p>
             <w:pPr>
@@ -1690,13 +1455,13 @@
               <w:rPr>
                 <w:rFonts w:asciiTheme="majorHAnsi" w:hAnsiTheme="majorHAnsi" w:cstheme="majorHAnsi"/>
               </w:rPr>
-              <w:t>Provides complete list with necessary specifications.</w:t>
+              <w:t>Makes minor omissions and/or includes vague specifications.</w:t>
             </w:r>
           </w:p>
         </w:tc>
         <w:tc>
           <w:tcPr>
-            <w:tcW w:w="1606" w:type="dxa"/>
+            <w:tcW w:w="1564" w:type="dxa"/>
           </w:tcPr>
           <w:p>
             <w:pPr>
@@ -1708,13 +1473,13 @@
               <w:rPr>
                 <w:rFonts w:asciiTheme="majorHAnsi" w:hAnsiTheme="majorHAnsi" w:cstheme="majorHAnsi"/>
               </w:rPr>
-              <w:t>7</w:t>
+              <w:t>5</w:t>
             </w:r>
           </w:p>
         </w:tc>
         <w:tc>
           <w:tcPr>
-            <w:tcW w:w="1418" w:type="dxa"/>
+            <w:tcW w:w="1515" w:type="dxa"/>
           </w:tcPr>
           <w:p>
             <w:pPr>
@@ -1728,13 +1493,13 @@
                 <w:b/>
                 <w:bCs/>
               </w:rPr>
-              <w:t>Almost There</w:t>
+              <w:t>Needs Work</w:t>
             </w:r>
           </w:p>
         </w:tc>
         <w:tc>
           <w:tcPr>
-            <w:tcW w:w="2029" w:type="dxa"/>
+            <w:tcW w:w="2014" w:type="dxa"/>
           </w:tcPr>
           <w:p>
             <w:pPr>
@@ -1746,13 +1511,13 @@
               <w:rPr>
                 <w:rFonts w:asciiTheme="majorHAnsi" w:hAnsiTheme="majorHAnsi" w:cstheme="majorHAnsi"/>
               </w:rPr>
-              <w:t>Makes minor omissions and/or includes vague specifications.</w:t>
+              <w:t>Omits major items and/or specifications.</w:t>
             </w:r>
           </w:p>
         </w:tc>
         <w:tc>
           <w:tcPr>
-            <w:tcW w:w="1606" w:type="dxa"/>
+            <w:tcW w:w="1565" w:type="dxa"/>
           </w:tcPr>
           <w:p>
             <w:pPr>
@@ -1764,13 +1529,13 @@
               <w:rPr>
                 <w:rFonts w:asciiTheme="majorHAnsi" w:hAnsiTheme="majorHAnsi" w:cstheme="majorHAnsi"/>
               </w:rPr>
-              <w:t>5</w:t>
+              <w:t>0</w:t>
             </w:r>
           </w:p>
         </w:tc>
         <w:tc>
           <w:tcPr>
-            <w:tcW w:w="1418" w:type="dxa"/>
+            <w:tcW w:w="1363" w:type="dxa"/>
           </w:tcPr>
           <w:p>
             <w:pPr>
@@ -1784,69 +1549,13 @@
                 <w:b/>
                 <w:bCs/>
               </w:rPr>
-              <w:t>Needs Work</w:t>
+              <w:t>Missing</w:t>
             </w:r>
           </w:p>
         </w:tc>
         <w:tc>
           <w:tcPr>
-            <w:tcW w:w="2029" w:type="dxa"/>
-          </w:tcPr>
-          <w:p>
-            <w:pPr>
-              <w:rPr>
-                <w:rFonts w:asciiTheme="majorHAnsi" w:hAnsiTheme="majorHAnsi" w:cstheme="majorHAnsi"/>
-              </w:rPr>
-            </w:pPr>
-            <w:r>
-              <w:rPr>
-                <w:rFonts w:asciiTheme="majorHAnsi" w:hAnsiTheme="majorHAnsi" w:cstheme="majorHAnsi"/>
-              </w:rPr>
-              <w:t>Omits major items and/or specifications.</w:t>
-            </w:r>
-          </w:p>
-        </w:tc>
-        <w:tc>
-          <w:tcPr>
-            <w:tcW w:w="1606" w:type="dxa"/>
-          </w:tcPr>
-          <w:p>
-            <w:pPr>
-              <w:rPr>
-                <w:rFonts w:asciiTheme="majorHAnsi" w:hAnsiTheme="majorHAnsi" w:cstheme="majorHAnsi"/>
-              </w:rPr>
-            </w:pPr>
-            <w:r>
-              <w:rPr>
-                <w:rFonts w:asciiTheme="majorHAnsi" w:hAnsiTheme="majorHAnsi" w:cstheme="majorHAnsi"/>
-              </w:rPr>
-              <w:t>0</w:t>
-            </w:r>
-          </w:p>
-        </w:tc>
-        <w:tc>
-          <w:tcPr>
-            <w:tcW w:w="1418" w:type="dxa"/>
-          </w:tcPr>
-          <w:p>
-            <w:pPr>
-              <w:rPr>
-                <w:rFonts w:asciiTheme="majorHAnsi" w:hAnsiTheme="majorHAnsi" w:cstheme="majorHAnsi"/>
-              </w:rPr>
-            </w:pPr>
-            <w:r>
-              <w:rPr>
-                <w:rFonts w:asciiTheme="majorHAnsi" w:hAnsiTheme="majorHAnsi" w:cstheme="majorHAnsi"/>
-                <w:b/>
-                <w:bCs/>
-              </w:rPr>
-              <w:t>Missing</w:t>
-            </w:r>
-          </w:p>
-        </w:tc>
-        <w:tc>
-          <w:tcPr>
-            <w:tcW w:w="2029" w:type="dxa"/>
+            <w:tcW w:w="2046" w:type="dxa"/>
           </w:tcPr>
           <w:p>
             <w:pPr>
@@ -1866,7 +1575,7 @@
       <w:tr>
         <w:tc>
           <w:tcPr>
-            <w:tcW w:w="1972" w:type="dxa"/>
+            <w:tcW w:w="1989" w:type="dxa"/>
           </w:tcPr>
           <w:p>
             <w:pPr>
@@ -1878,14 +1587,13 @@
               <w:rPr>
                 <w:rFonts w:asciiTheme="majorHAnsi" w:hAnsiTheme="majorHAnsi" w:cstheme="majorHAnsi"/>
               </w:rPr>
-              <w:lastRenderedPageBreak/>
               <w:t>Directions &amp; Step Quality</w:t>
             </w:r>
           </w:p>
         </w:tc>
         <w:tc>
           <w:tcPr>
-            <w:tcW w:w="1892" w:type="dxa"/>
+            <w:tcW w:w="2012" w:type="dxa"/>
           </w:tcPr>
           <w:p>
             <w:pPr>
@@ -1903,7 +1611,7 @@
         </w:tc>
         <w:tc>
           <w:tcPr>
-            <w:tcW w:w="701" w:type="dxa"/>
+            <w:tcW w:w="713" w:type="dxa"/>
           </w:tcPr>
           <w:p>
             <w:pPr>
@@ -1921,7 +1629,7 @@
         </w:tc>
         <w:tc>
           <w:tcPr>
-            <w:tcW w:w="1606" w:type="dxa"/>
+            <w:tcW w:w="1537" w:type="dxa"/>
           </w:tcPr>
           <w:p>
             <w:pPr>
@@ -1933,13 +1641,13 @@
               <w:rPr>
                 <w:rFonts w:asciiTheme="majorHAnsi" w:hAnsiTheme="majorHAnsi" w:cstheme="majorHAnsi"/>
               </w:rPr>
-              <w:t>12</w:t>
+              <w:t>9</w:t>
             </w:r>
           </w:p>
         </w:tc>
         <w:tc>
           <w:tcPr>
-            <w:tcW w:w="1418" w:type="dxa"/>
+            <w:tcW w:w="1393" w:type="dxa"/>
           </w:tcPr>
           <w:p>
             <w:pPr>
@@ -1953,13 +1661,13 @@
                 <w:b/>
                 <w:bCs/>
               </w:rPr>
-              <w:t>Exceeds Expectations</w:t>
+              <w:t>Meets Expectations</w:t>
             </w:r>
           </w:p>
         </w:tc>
         <w:tc>
           <w:tcPr>
-            <w:tcW w:w="2413" w:type="dxa"/>
+            <w:tcW w:w="1981" w:type="dxa"/>
           </w:tcPr>
           <w:p>
             <w:pPr>
@@ -1971,13 +1679,13 @@
               <w:rPr>
                 <w:rFonts w:asciiTheme="majorHAnsi" w:hAnsiTheme="majorHAnsi" w:cstheme="majorHAnsi"/>
               </w:rPr>
-              <w:t>Uses well-organized steps with active verbs and properly formatted lists.</w:t>
+              <w:t>Uses clear, complete, and correctly formatted steps. Uses active verbs throughout.</w:t>
             </w:r>
           </w:p>
         </w:tc>
         <w:tc>
           <w:tcPr>
-            <w:tcW w:w="1576" w:type="dxa"/>
+            <w:tcW w:w="1563" w:type="dxa"/>
           </w:tcPr>
           <w:p>
             <w:pPr>
@@ -1989,13 +1697,13 @@
               <w:rPr>
                 <w:rFonts w:asciiTheme="majorHAnsi" w:hAnsiTheme="majorHAnsi" w:cstheme="majorHAnsi"/>
               </w:rPr>
-              <w:t>10</w:t>
+              <w:t>7</w:t>
             </w:r>
           </w:p>
         </w:tc>
         <w:tc>
           <w:tcPr>
-            <w:tcW w:w="1389" w:type="dxa"/>
+            <w:tcW w:w="1403" w:type="dxa"/>
           </w:tcPr>
           <w:p>
             <w:pPr>
@@ -2009,13 +1717,13 @@
                 <w:b/>
                 <w:bCs/>
               </w:rPr>
-              <w:t>Meets Expectations</w:t>
+              <w:t>Almost There</w:t>
             </w:r>
           </w:p>
         </w:tc>
         <w:tc>
           <w:tcPr>
-            <w:tcW w:w="1991" w:type="dxa"/>
+            <w:tcW w:w="2015" w:type="dxa"/>
           </w:tcPr>
           <w:p>
             <w:pPr>
@@ -2027,13 +1735,13 @@
               <w:rPr>
                 <w:rFonts w:asciiTheme="majorHAnsi" w:hAnsiTheme="majorHAnsi" w:cstheme="majorHAnsi"/>
               </w:rPr>
-              <w:t>Uses clear, complete, and correctly formatted steps. Uses active verbs throughout.</w:t>
+              <w:t>Includes some multi-action or mis-formatted steps, and/or occasional active verb errors.</w:t>
             </w:r>
           </w:p>
         </w:tc>
         <w:tc>
           <w:tcPr>
-            <w:tcW w:w="1606" w:type="dxa"/>
+            <w:tcW w:w="1564" w:type="dxa"/>
           </w:tcPr>
           <w:p>
             <w:pPr>
@@ -2045,13 +1753,13 @@
               <w:rPr>
                 <w:rFonts w:asciiTheme="majorHAnsi" w:hAnsiTheme="majorHAnsi" w:cstheme="majorHAnsi"/>
               </w:rPr>
-              <w:t>7</w:t>
+              <w:t>5</w:t>
             </w:r>
           </w:p>
         </w:tc>
         <w:tc>
           <w:tcPr>
-            <w:tcW w:w="1418" w:type="dxa"/>
+            <w:tcW w:w="1515" w:type="dxa"/>
           </w:tcPr>
           <w:p>
             <w:pPr>
@@ -2065,13 +1773,13 @@
                 <w:b/>
                 <w:bCs/>
               </w:rPr>
-              <w:t>Almost There</w:t>
+              <w:t>Needs Work</w:t>
             </w:r>
           </w:p>
         </w:tc>
         <w:tc>
           <w:tcPr>
-            <w:tcW w:w="2029" w:type="dxa"/>
+            <w:tcW w:w="2014" w:type="dxa"/>
           </w:tcPr>
           <w:p>
             <w:pPr>
@@ -2083,13 +1791,13 @@
               <w:rPr>
                 <w:rFonts w:asciiTheme="majorHAnsi" w:hAnsiTheme="majorHAnsi" w:cstheme="majorHAnsi"/>
               </w:rPr>
-              <w:t>Includes some multi-action or mis-formatted steps, and/or occasional active verb errors.</w:t>
+              <w:t>Includes many unclear/mis-ordered steps.</w:t>
             </w:r>
           </w:p>
         </w:tc>
         <w:tc>
           <w:tcPr>
-            <w:tcW w:w="1606" w:type="dxa"/>
+            <w:tcW w:w="1565" w:type="dxa"/>
           </w:tcPr>
           <w:p>
             <w:pPr>
@@ -2101,13 +1809,13 @@
               <w:rPr>
                 <w:rFonts w:asciiTheme="majorHAnsi" w:hAnsiTheme="majorHAnsi" w:cstheme="majorHAnsi"/>
               </w:rPr>
-              <w:t>5</w:t>
+              <w:t>0</w:t>
             </w:r>
           </w:p>
         </w:tc>
         <w:tc>
           <w:tcPr>
-            <w:tcW w:w="1418" w:type="dxa"/>
+            <w:tcW w:w="1363" w:type="dxa"/>
           </w:tcPr>
           <w:p>
             <w:pPr>
@@ -2121,69 +1829,13 @@
                 <w:b/>
                 <w:bCs/>
               </w:rPr>
-              <w:t>Needs Work</w:t>
+              <w:t>Missing</w:t>
             </w:r>
           </w:p>
         </w:tc>
         <w:tc>
           <w:tcPr>
-            <w:tcW w:w="2029" w:type="dxa"/>
-          </w:tcPr>
-          <w:p>
-            <w:pPr>
-              <w:rPr>
-                <w:rFonts w:asciiTheme="majorHAnsi" w:hAnsiTheme="majorHAnsi" w:cstheme="majorHAnsi"/>
-              </w:rPr>
-            </w:pPr>
-            <w:r>
-              <w:rPr>
-                <w:rFonts w:asciiTheme="majorHAnsi" w:hAnsiTheme="majorHAnsi" w:cstheme="majorHAnsi"/>
-              </w:rPr>
-              <w:t>Includes many unclear/mis-ordered steps.</w:t>
-            </w:r>
-          </w:p>
-        </w:tc>
-        <w:tc>
-          <w:tcPr>
-            <w:tcW w:w="1606" w:type="dxa"/>
-          </w:tcPr>
-          <w:p>
-            <w:pPr>
-              <w:rPr>
-                <w:rFonts w:asciiTheme="majorHAnsi" w:hAnsiTheme="majorHAnsi" w:cstheme="majorHAnsi"/>
-              </w:rPr>
-            </w:pPr>
-            <w:r>
-              <w:rPr>
-                <w:rFonts w:asciiTheme="majorHAnsi" w:hAnsiTheme="majorHAnsi" w:cstheme="majorHAnsi"/>
-              </w:rPr>
-              <w:t>0</w:t>
-            </w:r>
-          </w:p>
-        </w:tc>
-        <w:tc>
-          <w:tcPr>
-            <w:tcW w:w="1418" w:type="dxa"/>
-          </w:tcPr>
-          <w:p>
-            <w:pPr>
-              <w:rPr>
-                <w:rFonts w:asciiTheme="majorHAnsi" w:hAnsiTheme="majorHAnsi" w:cstheme="majorHAnsi"/>
-              </w:rPr>
-            </w:pPr>
-            <w:r>
-              <w:rPr>
-                <w:rFonts w:asciiTheme="majorHAnsi" w:hAnsiTheme="majorHAnsi" w:cstheme="majorHAnsi"/>
-                <w:b/>
-                <w:bCs/>
-              </w:rPr>
-              <w:t>Missing</w:t>
-            </w:r>
-          </w:p>
-        </w:tc>
-        <w:tc>
-          <w:tcPr>
-            <w:tcW w:w="2029" w:type="dxa"/>
+            <w:tcW w:w="2046" w:type="dxa"/>
           </w:tcPr>
           <w:p>
             <w:pPr>
@@ -2203,7 +1855,7 @@
       <w:tr>
         <w:tc>
           <w:tcPr>
-            <w:tcW w:w="1972" w:type="dxa"/>
+            <w:tcW w:w="1989" w:type="dxa"/>
           </w:tcPr>
           <w:p>
             <w:pPr>
@@ -2227,7 +1879,7 @@
         </w:tc>
         <w:tc>
           <w:tcPr>
-            <w:tcW w:w="1892" w:type="dxa"/>
+            <w:tcW w:w="2012" w:type="dxa"/>
           </w:tcPr>
           <w:p>
             <w:pPr>
@@ -2245,7 +1897,7 @@
         </w:tc>
         <w:tc>
           <w:tcPr>
-            <w:tcW w:w="701" w:type="dxa"/>
+            <w:tcW w:w="713" w:type="dxa"/>
           </w:tcPr>
           <w:p>
             <w:pPr>
@@ -2263,7 +1915,7 @@
         </w:tc>
         <w:tc>
           <w:tcPr>
-            <w:tcW w:w="1606" w:type="dxa"/>
+            <w:tcW w:w="1537" w:type="dxa"/>
           </w:tcPr>
           <w:p>
             <w:pPr>
@@ -2275,13 +1927,13 @@
               <w:rPr>
                 <w:rFonts w:asciiTheme="majorHAnsi" w:hAnsiTheme="majorHAnsi" w:cstheme="majorHAnsi"/>
               </w:rPr>
-              <w:t>12</w:t>
+              <w:t>9</w:t>
             </w:r>
           </w:p>
         </w:tc>
         <w:tc>
           <w:tcPr>
-            <w:tcW w:w="1418" w:type="dxa"/>
+            <w:tcW w:w="1393" w:type="dxa"/>
           </w:tcPr>
           <w:p>
             <w:pPr>
@@ -2295,13 +1947,13 @@
                 <w:b/>
                 <w:bCs/>
               </w:rPr>
-              <w:t>Exceeds Expectations</w:t>
+              <w:t>Meets Expectations</w:t>
             </w:r>
           </w:p>
         </w:tc>
         <w:tc>
           <w:tcPr>
-            <w:tcW w:w="2413" w:type="dxa"/>
+            <w:tcW w:w="1981" w:type="dxa"/>
           </w:tcPr>
           <w:p>
             <w:pPr>
@@ -2313,13 +1965,13 @@
               <w:rPr>
                 <w:rFonts w:asciiTheme="majorHAnsi" w:hAnsiTheme="majorHAnsi" w:cstheme="majorHAnsi"/>
               </w:rPr>
-              <w:t>Provides a clear wrap-up with actionable troubleshooting and contact info.</w:t>
+              <w:t>Includes wrap-up, basic troubleshooting, and contact info.</w:t>
             </w:r>
           </w:p>
         </w:tc>
         <w:tc>
           <w:tcPr>
-            <w:tcW w:w="1576" w:type="dxa"/>
+            <w:tcW w:w="1563" w:type="dxa"/>
           </w:tcPr>
           <w:p>
             <w:pPr>
@@ -2331,13 +1983,13 @@
               <w:rPr>
                 <w:rFonts w:asciiTheme="majorHAnsi" w:hAnsiTheme="majorHAnsi" w:cstheme="majorHAnsi"/>
               </w:rPr>
-              <w:t>10</w:t>
+              <w:t>7</w:t>
             </w:r>
           </w:p>
         </w:tc>
         <w:tc>
           <w:tcPr>
-            <w:tcW w:w="1389" w:type="dxa"/>
+            <w:tcW w:w="1403" w:type="dxa"/>
           </w:tcPr>
           <w:p>
             <w:pPr>
@@ -2351,13 +2003,13 @@
                 <w:b/>
                 <w:bCs/>
               </w:rPr>
-              <w:t>Meets Expectations</w:t>
+              <w:t>Almost There</w:t>
             </w:r>
           </w:p>
         </w:tc>
         <w:tc>
           <w:tcPr>
-            <w:tcW w:w="1991" w:type="dxa"/>
+            <w:tcW w:w="2015" w:type="dxa"/>
           </w:tcPr>
           <w:p>
             <w:pPr>
@@ -2369,13 +2021,13 @@
               <w:rPr>
                 <w:rFonts w:asciiTheme="majorHAnsi" w:hAnsiTheme="majorHAnsi" w:cstheme="majorHAnsi"/>
               </w:rPr>
-              <w:t>Includes wrap-up, basic troubleshooting, and contact info.</w:t>
+              <w:t>Omits or does not fully provide one element (e.g., troubleshooting information missing).</w:t>
             </w:r>
           </w:p>
         </w:tc>
         <w:tc>
           <w:tcPr>
-            <w:tcW w:w="1606" w:type="dxa"/>
+            <w:tcW w:w="1564" w:type="dxa"/>
           </w:tcPr>
           <w:p>
             <w:pPr>
@@ -2387,13 +2039,13 @@
               <w:rPr>
                 <w:rFonts w:asciiTheme="majorHAnsi" w:hAnsiTheme="majorHAnsi" w:cstheme="majorHAnsi"/>
               </w:rPr>
-              <w:t>7</w:t>
+              <w:t>5</w:t>
             </w:r>
           </w:p>
         </w:tc>
         <w:tc>
           <w:tcPr>
-            <w:tcW w:w="1418" w:type="dxa"/>
+            <w:tcW w:w="1515" w:type="dxa"/>
           </w:tcPr>
           <w:p>
             <w:pPr>
@@ -2407,13 +2059,13 @@
                 <w:b/>
                 <w:bCs/>
               </w:rPr>
-              <w:t>Almost There</w:t>
+              <w:t>Needs Work</w:t>
             </w:r>
           </w:p>
         </w:tc>
         <w:tc>
           <w:tcPr>
-            <w:tcW w:w="2029" w:type="dxa"/>
+            <w:tcW w:w="2014" w:type="dxa"/>
           </w:tcPr>
           <w:p>
             <w:pPr>
@@ -2425,25 +2077,13 @@
               <w:rPr>
                 <w:rFonts w:asciiTheme="majorHAnsi" w:hAnsiTheme="majorHAnsi" w:cstheme="majorHAnsi"/>
               </w:rPr>
-              <w:t>Omits or does not fully provide one element</w:t>
-            </w:r>
-            <w:r>
-              <w:rPr>
-                <w:rFonts w:asciiTheme="majorHAnsi" w:hAnsiTheme="majorHAnsi" w:cstheme="majorHAnsi"/>
-              </w:rPr>
-              <w:t xml:space="preserve"> (e.g., troubleshooting information missing)</w:t>
-            </w:r>
-            <w:r>
-              <w:rPr>
-                <w:rFonts w:asciiTheme="majorHAnsi" w:hAnsiTheme="majorHAnsi" w:cstheme="majorHAnsi"/>
-              </w:rPr>
-              <w:t>.</w:t>
+              <w:t>Omits more than one element.</w:t>
             </w:r>
           </w:p>
         </w:tc>
         <w:tc>
           <w:tcPr>
-            <w:tcW w:w="1606" w:type="dxa"/>
+            <w:tcW w:w="1565" w:type="dxa"/>
           </w:tcPr>
           <w:p>
             <w:pPr>
@@ -2455,13 +2095,13 @@
               <w:rPr>
                 <w:rFonts w:asciiTheme="majorHAnsi" w:hAnsiTheme="majorHAnsi" w:cstheme="majorHAnsi"/>
               </w:rPr>
-              <w:t>5</w:t>
+              <w:t>0</w:t>
             </w:r>
           </w:p>
         </w:tc>
         <w:tc>
           <w:tcPr>
-            <w:tcW w:w="1418" w:type="dxa"/>
+            <w:tcW w:w="1363" w:type="dxa"/>
           </w:tcPr>
           <w:p>
             <w:pPr>
@@ -2475,69 +2115,13 @@
                 <w:b/>
                 <w:bCs/>
               </w:rPr>
-              <w:t>Needs Work</w:t>
+              <w:t>Missing</w:t>
             </w:r>
           </w:p>
         </w:tc>
         <w:tc>
           <w:tcPr>
-            <w:tcW w:w="2029" w:type="dxa"/>
-          </w:tcPr>
-          <w:p>
-            <w:pPr>
-              <w:rPr>
-                <w:rFonts w:asciiTheme="majorHAnsi" w:hAnsiTheme="majorHAnsi" w:cstheme="majorHAnsi"/>
-              </w:rPr>
-            </w:pPr>
-            <w:r>
-              <w:rPr>
-                <w:rFonts w:asciiTheme="majorHAnsi" w:hAnsiTheme="majorHAnsi" w:cstheme="majorHAnsi"/>
-              </w:rPr>
-              <w:t>Omits more than one element.</w:t>
-            </w:r>
-          </w:p>
-        </w:tc>
-        <w:tc>
-          <w:tcPr>
-            <w:tcW w:w="1606" w:type="dxa"/>
-          </w:tcPr>
-          <w:p>
-            <w:pPr>
-              <w:rPr>
-                <w:rFonts w:asciiTheme="majorHAnsi" w:hAnsiTheme="majorHAnsi" w:cstheme="majorHAnsi"/>
-              </w:rPr>
-            </w:pPr>
-            <w:r>
-              <w:rPr>
-                <w:rFonts w:asciiTheme="majorHAnsi" w:hAnsiTheme="majorHAnsi" w:cstheme="majorHAnsi"/>
-              </w:rPr>
-              <w:t>0</w:t>
-            </w:r>
-          </w:p>
-        </w:tc>
-        <w:tc>
-          <w:tcPr>
-            <w:tcW w:w="1418" w:type="dxa"/>
-          </w:tcPr>
-          <w:p>
-            <w:pPr>
-              <w:rPr>
-                <w:rFonts w:asciiTheme="majorHAnsi" w:hAnsiTheme="majorHAnsi" w:cstheme="majorHAnsi"/>
-              </w:rPr>
-            </w:pPr>
-            <w:r>
-              <w:rPr>
-                <w:rFonts w:asciiTheme="majorHAnsi" w:hAnsiTheme="majorHAnsi" w:cstheme="majorHAnsi"/>
-                <w:b/>
-                <w:bCs/>
-              </w:rPr>
-              <w:t>Missing</w:t>
-            </w:r>
-          </w:p>
-        </w:tc>
-        <w:tc>
-          <w:tcPr>
-            <w:tcW w:w="2029" w:type="dxa"/>
+            <w:tcW w:w="2046" w:type="dxa"/>
           </w:tcPr>
           <w:p>
             <w:pPr>
@@ -2570,7 +2154,7 @@
       <w:tr>
         <w:tc>
           <w:tcPr>
-            <w:tcW w:w="1972" w:type="dxa"/>
+            <w:tcW w:w="1989" w:type="dxa"/>
           </w:tcPr>
           <w:p>
             <w:pPr>
@@ -2588,7 +2172,7 @@
         </w:tc>
         <w:tc>
           <w:tcPr>
-            <w:tcW w:w="1892" w:type="dxa"/>
+            <w:tcW w:w="2012" w:type="dxa"/>
           </w:tcPr>
           <w:p>
             <w:pPr>
@@ -2606,7 +2190,7 @@
         </w:tc>
         <w:tc>
           <w:tcPr>
-            <w:tcW w:w="701" w:type="dxa"/>
+            <w:tcW w:w="713" w:type="dxa"/>
           </w:tcPr>
           <w:p>
             <w:pPr>
@@ -2624,7 +2208,7 @@
         </w:tc>
         <w:tc>
           <w:tcPr>
-            <w:tcW w:w="1606" w:type="dxa"/>
+            <w:tcW w:w="1537" w:type="dxa"/>
           </w:tcPr>
           <w:p>
             <w:pPr>
@@ -2636,13 +2220,13 @@
               <w:rPr>
                 <w:rFonts w:asciiTheme="majorHAnsi" w:hAnsiTheme="majorHAnsi" w:cstheme="majorHAnsi"/>
               </w:rPr>
-              <w:t>12</w:t>
+              <w:t>9</w:t>
             </w:r>
           </w:p>
         </w:tc>
         <w:tc>
           <w:tcPr>
-            <w:tcW w:w="1418" w:type="dxa"/>
+            <w:tcW w:w="1393" w:type="dxa"/>
           </w:tcPr>
           <w:p>
             <w:pPr>
@@ -2658,13 +2242,13 @@
                 <w:b/>
                 <w:bCs/>
               </w:rPr>
-              <w:t>Exceeds Expectations</w:t>
+              <w:t>Meets Expectations</w:t>
             </w:r>
           </w:p>
         </w:tc>
         <w:tc>
           <w:tcPr>
-            <w:tcW w:w="2413" w:type="dxa"/>
+            <w:tcW w:w="1981" w:type="dxa"/>
           </w:tcPr>
           <w:p>
             <w:pPr>
@@ -2676,13 +2260,13 @@
               <w:rPr>
                 <w:rFonts w:asciiTheme="majorHAnsi" w:hAnsiTheme="majorHAnsi" w:cstheme="majorHAnsi"/>
               </w:rPr>
-              <w:t>Includes 4 or more relevant, professional visuals; provides clear two-part captions; refers directly in the text with full explanation and context.</w:t>
+              <w:t>Includes 4 or more useful visuals with accurate two-part captions; refers directly in the text with clear explanation and context.</w:t>
             </w:r>
           </w:p>
         </w:tc>
         <w:tc>
           <w:tcPr>
-            <w:tcW w:w="1576" w:type="dxa"/>
+            <w:tcW w:w="1563" w:type="dxa"/>
           </w:tcPr>
           <w:p>
             <w:pPr>
@@ -2694,13 +2278,13 @@
               <w:rPr>
                 <w:rFonts w:asciiTheme="majorHAnsi" w:hAnsiTheme="majorHAnsi" w:cstheme="majorHAnsi"/>
               </w:rPr>
-              <w:t>10</w:t>
+              <w:t>7</w:t>
             </w:r>
           </w:p>
         </w:tc>
         <w:tc>
           <w:tcPr>
-            <w:tcW w:w="1389" w:type="dxa"/>
+            <w:tcW w:w="1403" w:type="dxa"/>
           </w:tcPr>
           <w:p>
             <w:pPr>
@@ -2716,13 +2300,13 @@
                 <w:b/>
                 <w:bCs/>
               </w:rPr>
-              <w:t>Meets Expectations</w:t>
+              <w:t>Almost There</w:t>
             </w:r>
           </w:p>
         </w:tc>
         <w:tc>
           <w:tcPr>
-            <w:tcW w:w="1991" w:type="dxa"/>
+            <w:tcW w:w="2015" w:type="dxa"/>
           </w:tcPr>
           <w:p>
             <w:pPr>
@@ -2734,13 +2318,13 @@
               <w:rPr>
                 <w:rFonts w:asciiTheme="majorHAnsi" w:hAnsiTheme="majorHAnsi" w:cstheme="majorHAnsi"/>
               </w:rPr>
-              <w:t>Includes 4 or more useful visuals with accurate two-part captions; refers directly in the text with clear explanation and context.</w:t>
+              <w:t>Includes 4 or more visuals but captions are incomplete, context is limited, or references are unclear.</w:t>
             </w:r>
           </w:p>
         </w:tc>
         <w:tc>
           <w:tcPr>
-            <w:tcW w:w="1606" w:type="dxa"/>
+            <w:tcW w:w="1564" w:type="dxa"/>
           </w:tcPr>
           <w:p>
             <w:pPr>
@@ -2752,13 +2336,13 @@
               <w:rPr>
                 <w:rFonts w:asciiTheme="majorHAnsi" w:hAnsiTheme="majorHAnsi" w:cstheme="majorHAnsi"/>
               </w:rPr>
-              <w:t>7</w:t>
+              <w:t>5</w:t>
             </w:r>
           </w:p>
         </w:tc>
         <w:tc>
           <w:tcPr>
-            <w:tcW w:w="1418" w:type="dxa"/>
+            <w:tcW w:w="1515" w:type="dxa"/>
           </w:tcPr>
           <w:p>
             <w:pPr>
@@ -2774,13 +2358,13 @@
                 <w:b/>
                 <w:bCs/>
               </w:rPr>
-              <w:t>Almost There</w:t>
+              <w:t>Needs Work</w:t>
             </w:r>
           </w:p>
         </w:tc>
         <w:tc>
           <w:tcPr>
-            <w:tcW w:w="2029" w:type="dxa"/>
+            <w:tcW w:w="2014" w:type="dxa"/>
           </w:tcPr>
           <w:p>
             <w:pPr>
@@ -2792,13 +2376,13 @@
               <w:rPr>
                 <w:rFonts w:asciiTheme="majorHAnsi" w:hAnsiTheme="majorHAnsi" w:cstheme="majorHAnsi"/>
               </w:rPr>
-              <w:t>Includes 4 or more visuals but captions are incomplete, context is limited, or references are unclear.</w:t>
+              <w:t>Includes visuals that are weak, irrelevant, or unprofessional. Does not include captions or references in the text to explain them.</w:t>
             </w:r>
           </w:p>
         </w:tc>
         <w:tc>
           <w:tcPr>
-            <w:tcW w:w="1606" w:type="dxa"/>
+            <w:tcW w:w="1565" w:type="dxa"/>
           </w:tcPr>
           <w:p>
             <w:pPr>
@@ -2810,13 +2394,13 @@
               <w:rPr>
                 <w:rFonts w:asciiTheme="majorHAnsi" w:hAnsiTheme="majorHAnsi" w:cstheme="majorHAnsi"/>
               </w:rPr>
-              <w:t>5</w:t>
+              <w:t>0</w:t>
             </w:r>
           </w:p>
         </w:tc>
         <w:tc>
           <w:tcPr>
-            <w:tcW w:w="1418" w:type="dxa"/>
+            <w:tcW w:w="1363" w:type="dxa"/>
           </w:tcPr>
           <w:p>
             <w:pPr>
@@ -2832,71 +2416,13 @@
                 <w:b/>
                 <w:bCs/>
               </w:rPr>
-              <w:t>Needs Work</w:t>
+              <w:t>Missing</w:t>
             </w:r>
           </w:p>
         </w:tc>
         <w:tc>
           <w:tcPr>
-            <w:tcW w:w="2029" w:type="dxa"/>
-          </w:tcPr>
-          <w:p>
-            <w:pPr>
-              <w:rPr>
-                <w:rFonts w:asciiTheme="majorHAnsi" w:hAnsiTheme="majorHAnsi" w:cstheme="majorHAnsi"/>
-              </w:rPr>
-            </w:pPr>
-            <w:r>
-              <w:rPr>
-                <w:rFonts w:asciiTheme="majorHAnsi" w:hAnsiTheme="majorHAnsi" w:cstheme="majorHAnsi"/>
-              </w:rPr>
-              <w:t>Includes visuals that are weak, irrelevant, or unprofessional. Does not include captions or references in the text to explain them.</w:t>
-            </w:r>
-          </w:p>
-        </w:tc>
-        <w:tc>
-          <w:tcPr>
-            <w:tcW w:w="1606" w:type="dxa"/>
-          </w:tcPr>
-          <w:p>
-            <w:pPr>
-              <w:rPr>
-                <w:rFonts w:asciiTheme="majorHAnsi" w:hAnsiTheme="majorHAnsi" w:cstheme="majorHAnsi"/>
-              </w:rPr>
-            </w:pPr>
-            <w:r>
-              <w:rPr>
-                <w:rFonts w:asciiTheme="majorHAnsi" w:hAnsiTheme="majorHAnsi" w:cstheme="majorHAnsi"/>
-              </w:rPr>
-              <w:t>0</w:t>
-            </w:r>
-          </w:p>
-        </w:tc>
-        <w:tc>
-          <w:tcPr>
-            <w:tcW w:w="1418" w:type="dxa"/>
-          </w:tcPr>
-          <w:p>
-            <w:pPr>
-              <w:rPr>
-                <w:rFonts w:asciiTheme="majorHAnsi" w:hAnsiTheme="majorHAnsi" w:cstheme="majorHAnsi"/>
-                <w:b/>
-                <w:bCs/>
-              </w:rPr>
-            </w:pPr>
-            <w:r>
-              <w:rPr>
-                <w:rFonts w:asciiTheme="majorHAnsi" w:hAnsiTheme="majorHAnsi" w:cstheme="majorHAnsi"/>
-                <w:b/>
-                <w:bCs/>
-              </w:rPr>
-              <w:t>Missing</w:t>
-            </w:r>
-          </w:p>
-        </w:tc>
-        <w:tc>
-          <w:tcPr>
-            <w:tcW w:w="2029" w:type="dxa"/>
+            <w:tcW w:w="2046" w:type="dxa"/>
           </w:tcPr>
           <w:p>
             <w:pPr>
@@ -2916,7 +2442,7 @@
       <w:tr>
         <w:tc>
           <w:tcPr>
-            <w:tcW w:w="1972" w:type="dxa"/>
+            <w:tcW w:w="1989" w:type="dxa"/>
           </w:tcPr>
           <w:p>
             <w:pPr>
@@ -2934,7 +2460,7 @@
         </w:tc>
         <w:tc>
           <w:tcPr>
-            <w:tcW w:w="1892" w:type="dxa"/>
+            <w:tcW w:w="2012" w:type="dxa"/>
           </w:tcPr>
           <w:p>
             <w:pPr>
@@ -2952,7 +2478,7 @@
         </w:tc>
         <w:tc>
           <w:tcPr>
-            <w:tcW w:w="701" w:type="dxa"/>
+            <w:tcW w:w="713" w:type="dxa"/>
           </w:tcPr>
           <w:p>
             <w:pPr>
@@ -2970,7 +2496,7 @@
         </w:tc>
         <w:tc>
           <w:tcPr>
-            <w:tcW w:w="1606" w:type="dxa"/>
+            <w:tcW w:w="1537" w:type="dxa"/>
           </w:tcPr>
           <w:p>
             <w:pPr>
@@ -2982,35 +2508,33 @@
               <w:rPr>
                 <w:rFonts w:asciiTheme="majorHAnsi" w:hAnsiTheme="majorHAnsi" w:cstheme="majorHAnsi"/>
               </w:rPr>
-              <w:t>12</w:t>
+              <w:t>9</w:t>
             </w:r>
           </w:p>
         </w:tc>
         <w:tc>
           <w:tcPr>
-            <w:tcW w:w="1418" w:type="dxa"/>
+            <w:tcW w:w="1393" w:type="dxa"/>
           </w:tcPr>
           <w:p>
             <w:pPr>
               <w:rPr>
                 <w:rFonts w:asciiTheme="majorHAnsi" w:hAnsiTheme="majorHAnsi" w:cstheme="majorHAnsi"/>
+              </w:rPr>
+            </w:pPr>
+            <w:r>
+              <w:rPr>
+                <w:rFonts w:asciiTheme="majorHAnsi" w:hAnsiTheme="majorHAnsi" w:cstheme="majorHAnsi"/>
                 <w:b/>
                 <w:bCs/>
               </w:rPr>
-            </w:pPr>
-            <w:r>
-              <w:rPr>
-                <w:rFonts w:asciiTheme="majorHAnsi" w:hAnsiTheme="majorHAnsi" w:cstheme="majorHAnsi"/>
-                <w:b/>
-                <w:bCs/>
-              </w:rPr>
-              <w:t>Exceeds Expectations</w:t>
+              <w:t>Meets Expectations</w:t>
             </w:r>
           </w:p>
         </w:tc>
         <w:tc>
           <w:tcPr>
-            <w:tcW w:w="2413" w:type="dxa"/>
+            <w:tcW w:w="1981" w:type="dxa"/>
           </w:tcPr>
           <w:p>
             <w:pPr>
@@ -3022,13 +2546,19 @@
               <w:rPr>
                 <w:rFonts w:asciiTheme="majorHAnsi" w:hAnsiTheme="majorHAnsi" w:cstheme="majorHAnsi"/>
               </w:rPr>
-              <w:t>Cites all sources accurately with correct formatting.</w:t>
+              <w:t>Includes all sources with consistent formatting</w:t>
+            </w:r>
+            <w:r>
+              <w:rPr>
+                <w:rFonts w:asciiTheme="majorHAnsi" w:hAnsiTheme="majorHAnsi" w:cstheme="majorHAnsi"/>
+              </w:rPr>
+              <w:t xml:space="preserve"> OR No documentation needed.</w:t>
             </w:r>
           </w:p>
         </w:tc>
         <w:tc>
           <w:tcPr>
-            <w:tcW w:w="1576" w:type="dxa"/>
+            <w:tcW w:w="1563" w:type="dxa"/>
           </w:tcPr>
           <w:p>
             <w:pPr>
@@ -3040,13 +2570,13 @@
               <w:rPr>
                 <w:rFonts w:asciiTheme="majorHAnsi" w:hAnsiTheme="majorHAnsi" w:cstheme="majorHAnsi"/>
               </w:rPr>
-              <w:t>10</w:t>
+              <w:t>7</w:t>
             </w:r>
           </w:p>
         </w:tc>
         <w:tc>
           <w:tcPr>
-            <w:tcW w:w="1389" w:type="dxa"/>
+            <w:tcW w:w="1403" w:type="dxa"/>
           </w:tcPr>
           <w:p>
             <w:pPr>
@@ -3060,13 +2590,13 @@
                 <w:b/>
                 <w:bCs/>
               </w:rPr>
-              <w:t>Meets Expectations</w:t>
+              <w:t>Almost There</w:t>
             </w:r>
           </w:p>
         </w:tc>
         <w:tc>
           <w:tcPr>
-            <w:tcW w:w="1991" w:type="dxa"/>
+            <w:tcW w:w="2015" w:type="dxa"/>
           </w:tcPr>
           <w:p>
             <w:pPr>
@@ -3078,19 +2608,13 @@
               <w:rPr>
                 <w:rFonts w:asciiTheme="majorHAnsi" w:hAnsiTheme="majorHAnsi" w:cstheme="majorHAnsi"/>
               </w:rPr>
-              <w:t>Includes all sources with consistent formatting</w:t>
-            </w:r>
-            <w:r>
-              <w:rPr>
-                <w:rFonts w:asciiTheme="majorHAnsi" w:hAnsiTheme="majorHAnsi" w:cstheme="majorHAnsi"/>
-              </w:rPr>
-              <w:t xml:space="preserve"> OR No documentation needed.</w:t>
+              <w:t>Omits a source and/or makes minor formatting errors.</w:t>
             </w:r>
           </w:p>
         </w:tc>
         <w:tc>
           <w:tcPr>
-            <w:tcW w:w="1606" w:type="dxa"/>
+            <w:tcW w:w="1564" w:type="dxa"/>
           </w:tcPr>
           <w:p>
             <w:pPr>
@@ -3102,33 +2626,35 @@
               <w:rPr>
                 <w:rFonts w:asciiTheme="majorHAnsi" w:hAnsiTheme="majorHAnsi" w:cstheme="majorHAnsi"/>
               </w:rPr>
-              <w:t>7</w:t>
+              <w:t>5</w:t>
             </w:r>
           </w:p>
         </w:tc>
         <w:tc>
           <w:tcPr>
-            <w:tcW w:w="1418" w:type="dxa"/>
+            <w:tcW w:w="1515" w:type="dxa"/>
           </w:tcPr>
           <w:p>
             <w:pPr>
               <w:rPr>
                 <w:rFonts w:asciiTheme="majorHAnsi" w:hAnsiTheme="majorHAnsi" w:cstheme="majorHAnsi"/>
-              </w:rPr>
-            </w:pPr>
-            <w:r>
-              <w:rPr>
-                <w:rFonts w:asciiTheme="majorHAnsi" w:hAnsiTheme="majorHAnsi" w:cstheme="majorHAnsi"/>
                 <w:b/>
                 <w:bCs/>
               </w:rPr>
-              <w:t>Almost There</w:t>
+            </w:pPr>
+            <w:r>
+              <w:rPr>
+                <w:rFonts w:asciiTheme="majorHAnsi" w:hAnsiTheme="majorHAnsi" w:cstheme="majorHAnsi"/>
+                <w:b/>
+                <w:bCs/>
+              </w:rPr>
+              <w:t>Needs Work</w:t>
             </w:r>
           </w:p>
         </w:tc>
         <w:tc>
           <w:tcPr>
-            <w:tcW w:w="2029" w:type="dxa"/>
+            <w:tcW w:w="2014" w:type="dxa"/>
           </w:tcPr>
           <w:p>
             <w:pPr>
@@ -3140,13 +2666,13 @@
               <w:rPr>
                 <w:rFonts w:asciiTheme="majorHAnsi" w:hAnsiTheme="majorHAnsi" w:cstheme="majorHAnsi"/>
               </w:rPr>
-              <w:t>Omits a source and/or makes minor formatting errors.</w:t>
+              <w:t>Omits two or more sources and/or makes frequent formatting errors.</w:t>
             </w:r>
           </w:p>
         </w:tc>
         <w:tc>
           <w:tcPr>
-            <w:tcW w:w="1606" w:type="dxa"/>
+            <w:tcW w:w="1565" w:type="dxa"/>
           </w:tcPr>
           <w:p>
             <w:pPr>
@@ -3158,13 +2684,13 @@
               <w:rPr>
                 <w:rFonts w:asciiTheme="majorHAnsi" w:hAnsiTheme="majorHAnsi" w:cstheme="majorHAnsi"/>
               </w:rPr>
-              <w:t>5</w:t>
+              <w:t>0</w:t>
             </w:r>
           </w:p>
         </w:tc>
         <w:tc>
           <w:tcPr>
-            <w:tcW w:w="1418" w:type="dxa"/>
+            <w:tcW w:w="1363" w:type="dxa"/>
           </w:tcPr>
           <w:p>
             <w:pPr>
@@ -3180,71 +2706,13 @@
                 <w:b/>
                 <w:bCs/>
               </w:rPr>
-              <w:t>Needs Work</w:t>
+              <w:t>Missing</w:t>
             </w:r>
           </w:p>
         </w:tc>
         <w:tc>
           <w:tcPr>
-            <w:tcW w:w="2029" w:type="dxa"/>
-          </w:tcPr>
-          <w:p>
-            <w:pPr>
-              <w:rPr>
-                <w:rFonts w:asciiTheme="majorHAnsi" w:hAnsiTheme="majorHAnsi" w:cstheme="majorHAnsi"/>
-              </w:rPr>
-            </w:pPr>
-            <w:r>
-              <w:rPr>
-                <w:rFonts w:asciiTheme="majorHAnsi" w:hAnsiTheme="majorHAnsi" w:cstheme="majorHAnsi"/>
-              </w:rPr>
-              <w:t>Omits two or more sources and/or makes frequent formatting errors.</w:t>
-            </w:r>
-          </w:p>
-        </w:tc>
-        <w:tc>
-          <w:tcPr>
-            <w:tcW w:w="1606" w:type="dxa"/>
-          </w:tcPr>
-          <w:p>
-            <w:pPr>
-              <w:rPr>
-                <w:rFonts w:asciiTheme="majorHAnsi" w:hAnsiTheme="majorHAnsi" w:cstheme="majorHAnsi"/>
-              </w:rPr>
-            </w:pPr>
-            <w:r>
-              <w:rPr>
-                <w:rFonts w:asciiTheme="majorHAnsi" w:hAnsiTheme="majorHAnsi" w:cstheme="majorHAnsi"/>
-              </w:rPr>
-              <w:t>0</w:t>
-            </w:r>
-          </w:p>
-        </w:tc>
-        <w:tc>
-          <w:tcPr>
-            <w:tcW w:w="1418" w:type="dxa"/>
-          </w:tcPr>
-          <w:p>
-            <w:pPr>
-              <w:rPr>
-                <w:rFonts w:asciiTheme="majorHAnsi" w:hAnsiTheme="majorHAnsi" w:cstheme="majorHAnsi"/>
-                <w:b/>
-                <w:bCs/>
-              </w:rPr>
-            </w:pPr>
-            <w:r>
-              <w:rPr>
-                <w:rFonts w:asciiTheme="majorHAnsi" w:hAnsiTheme="majorHAnsi" w:cstheme="majorHAnsi"/>
-                <w:b/>
-                <w:bCs/>
-              </w:rPr>
-              <w:t>Missing</w:t>
-            </w:r>
-          </w:p>
-        </w:tc>
-        <w:tc>
-          <w:tcPr>
-            <w:tcW w:w="2029" w:type="dxa"/>
+            <w:tcW w:w="2046" w:type="dxa"/>
           </w:tcPr>
           <w:p>
             <w:pPr>
@@ -3264,7 +2732,7 @@
       <w:tr>
         <w:tc>
           <w:tcPr>
-            <w:tcW w:w="1972" w:type="dxa"/>
+            <w:tcW w:w="1989" w:type="dxa"/>
           </w:tcPr>
           <w:p>
             <w:pPr>
@@ -3282,7 +2750,7 @@
         </w:tc>
         <w:tc>
           <w:tcPr>
-            <w:tcW w:w="1892" w:type="dxa"/>
+            <w:tcW w:w="2012" w:type="dxa"/>
           </w:tcPr>
           <w:p>
             <w:pPr>
@@ -3294,13 +2762,20 @@
               <w:rPr>
                 <w:rFonts w:asciiTheme="majorHAnsi" w:hAnsiTheme="majorHAnsi" w:cstheme="majorHAnsi"/>
               </w:rPr>
-              <w:t>Uses headings, lists, spacing, and paragraphing. Uses CRAP design principles, fonts, chunking, and other formatting elements effectively to increase readability.</w:t>
+              <w:t xml:space="preserve">Uses headings, lists, spacing, and paragraphing. Uses CRAP design principles, fonts, chunking, and other formatting </w:t>
+            </w:r>
+            <w:r>
+              <w:rPr>
+                <w:rFonts w:asciiTheme="majorHAnsi" w:hAnsiTheme="majorHAnsi" w:cstheme="majorHAnsi"/>
+              </w:rPr>
+              <w:lastRenderedPageBreak/>
+              <w:t>elements effectively to increase readability.</w:t>
             </w:r>
           </w:p>
         </w:tc>
         <w:tc>
           <w:tcPr>
-            <w:tcW w:w="701" w:type="dxa"/>
+            <w:tcW w:w="713" w:type="dxa"/>
           </w:tcPr>
           <w:p>
             <w:pPr>
@@ -3312,13 +2787,14 @@
               <w:rPr>
                 <w:rFonts w:asciiTheme="majorHAnsi" w:hAnsiTheme="majorHAnsi" w:cstheme="majorHAnsi"/>
               </w:rPr>
+              <w:lastRenderedPageBreak/>
               <w:t>False</w:t>
             </w:r>
           </w:p>
         </w:tc>
         <w:tc>
           <w:tcPr>
-            <w:tcW w:w="1606" w:type="dxa"/>
+            <w:tcW w:w="1537" w:type="dxa"/>
           </w:tcPr>
           <w:p>
             <w:pPr>
@@ -3330,35 +2806,33 @@
               <w:rPr>
                 <w:rFonts w:asciiTheme="majorHAnsi" w:hAnsiTheme="majorHAnsi" w:cstheme="majorHAnsi"/>
               </w:rPr>
-              <w:t>12</w:t>
+              <w:t>9</w:t>
             </w:r>
           </w:p>
         </w:tc>
         <w:tc>
           <w:tcPr>
-            <w:tcW w:w="1418" w:type="dxa"/>
+            <w:tcW w:w="1393" w:type="dxa"/>
           </w:tcPr>
           <w:p>
             <w:pPr>
               <w:rPr>
                 <w:rFonts w:asciiTheme="majorHAnsi" w:hAnsiTheme="majorHAnsi" w:cstheme="majorHAnsi"/>
+              </w:rPr>
+            </w:pPr>
+            <w:r>
+              <w:rPr>
+                <w:rFonts w:asciiTheme="majorHAnsi" w:hAnsiTheme="majorHAnsi" w:cstheme="majorHAnsi"/>
                 <w:b/>
                 <w:bCs/>
               </w:rPr>
-            </w:pPr>
-            <w:r>
-              <w:rPr>
-                <w:rFonts w:asciiTheme="majorHAnsi" w:hAnsiTheme="majorHAnsi" w:cstheme="majorHAnsi"/>
-                <w:b/>
-                <w:bCs/>
-              </w:rPr>
-              <w:t>Exceeds Expectations</w:t>
+              <w:t>Meets Expectations</w:t>
             </w:r>
           </w:p>
         </w:tc>
         <w:tc>
           <w:tcPr>
-            <w:tcW w:w="2413" w:type="dxa"/>
+            <w:tcW w:w="1981" w:type="dxa"/>
           </w:tcPr>
           <w:p>
             <w:pPr>
@@ -3370,20 +2844,20 @@
               <w:rPr>
                 <w:rFonts w:asciiTheme="majorHAnsi" w:hAnsiTheme="majorHAnsi" w:cstheme="majorHAnsi"/>
               </w:rPr>
-              <w:t xml:space="preserve">Uses flawless formatting. Shows strong contrast between headings and the document paragraphs. Uses spacing, fonts, and chunking and CRAP design principles to make the message </w:t>
+              <w:t xml:space="preserve">Uses accurate and appropriate formatting. Formats headings, spacing, and CRAP design principles consistently. Uses </w:t>
             </w:r>
             <w:r>
               <w:rPr>
                 <w:rFonts w:asciiTheme="majorHAnsi" w:hAnsiTheme="majorHAnsi" w:cstheme="majorHAnsi"/>
               </w:rPr>
               <w:lastRenderedPageBreak/>
-              <w:t>highly readable and professional.</w:t>
+              <w:t>lists, horizontal rules, and boxes as effective visual elements.</w:t>
             </w:r>
           </w:p>
         </w:tc>
         <w:tc>
           <w:tcPr>
-            <w:tcW w:w="1576" w:type="dxa"/>
+            <w:tcW w:w="1563" w:type="dxa"/>
           </w:tcPr>
           <w:p>
             <w:pPr>
@@ -3396,13 +2870,13 @@
                 <w:rFonts w:asciiTheme="majorHAnsi" w:hAnsiTheme="majorHAnsi" w:cstheme="majorHAnsi"/>
               </w:rPr>
               <w:lastRenderedPageBreak/>
-              <w:t>10</w:t>
+              <w:t>7</w:t>
             </w:r>
           </w:p>
         </w:tc>
         <w:tc>
           <w:tcPr>
-            <w:tcW w:w="1389" w:type="dxa"/>
+            <w:tcW w:w="1403" w:type="dxa"/>
           </w:tcPr>
           <w:p>
             <w:pPr>
@@ -3416,13 +2890,13 @@
                 <w:b/>
                 <w:bCs/>
               </w:rPr>
-              <w:t>Meets Expectations</w:t>
+              <w:t>Almost There</w:t>
             </w:r>
           </w:p>
         </w:tc>
         <w:tc>
           <w:tcPr>
-            <w:tcW w:w="1991" w:type="dxa"/>
+            <w:tcW w:w="2015" w:type="dxa"/>
           </w:tcPr>
           <w:p>
             <w:pPr>
@@ -3434,13 +2908,20 @@
               <w:rPr>
                 <w:rFonts w:asciiTheme="majorHAnsi" w:hAnsiTheme="majorHAnsi" w:cstheme="majorHAnsi"/>
               </w:rPr>
-              <w:t>Uses accurate and appropriate formatting. Formats headings, spacing, and CRAP design principles consistently. Uses lists, horizontal rules, and boxes as effective visual elements.</w:t>
+              <w:t xml:space="preserve">May include minor formatting errors and/or includes minor errors in headings, paragraphing, spacing, or </w:t>
+            </w:r>
+            <w:r>
+              <w:rPr>
+                <w:rFonts w:asciiTheme="majorHAnsi" w:hAnsiTheme="majorHAnsi" w:cstheme="majorHAnsi"/>
+              </w:rPr>
+              <w:lastRenderedPageBreak/>
+              <w:t>application of CRAP design principles.</w:t>
             </w:r>
           </w:p>
         </w:tc>
         <w:tc>
           <w:tcPr>
-            <w:tcW w:w="1606" w:type="dxa"/>
+            <w:tcW w:w="1564" w:type="dxa"/>
           </w:tcPr>
           <w:p>
             <w:pPr>
@@ -3452,33 +2933,36 @@
               <w:rPr>
                 <w:rFonts w:asciiTheme="majorHAnsi" w:hAnsiTheme="majorHAnsi" w:cstheme="majorHAnsi"/>
               </w:rPr>
-              <w:t>7</w:t>
+              <w:lastRenderedPageBreak/>
+              <w:t>5</w:t>
             </w:r>
           </w:p>
         </w:tc>
         <w:tc>
           <w:tcPr>
-            <w:tcW w:w="1418" w:type="dxa"/>
+            <w:tcW w:w="1515" w:type="dxa"/>
           </w:tcPr>
           <w:p>
             <w:pPr>
               <w:rPr>
                 <w:rFonts w:asciiTheme="majorHAnsi" w:hAnsiTheme="majorHAnsi" w:cstheme="majorHAnsi"/>
-              </w:rPr>
-            </w:pPr>
-            <w:r>
-              <w:rPr>
-                <w:rFonts w:asciiTheme="majorHAnsi" w:hAnsiTheme="majorHAnsi" w:cstheme="majorHAnsi"/>
                 <w:b/>
                 <w:bCs/>
               </w:rPr>
-              <w:t>Almost There</w:t>
+            </w:pPr>
+            <w:r>
+              <w:rPr>
+                <w:rFonts w:asciiTheme="majorHAnsi" w:hAnsiTheme="majorHAnsi" w:cstheme="majorHAnsi"/>
+                <w:b/>
+                <w:bCs/>
+              </w:rPr>
+              <w:t>Needs Work</w:t>
             </w:r>
           </w:p>
         </w:tc>
         <w:tc>
           <w:tcPr>
-            <w:tcW w:w="2029" w:type="dxa"/>
+            <w:tcW w:w="2014" w:type="dxa"/>
           </w:tcPr>
           <w:p>
             <w:pPr>
@@ -3490,13 +2974,20 @@
               <w:rPr>
                 <w:rFonts w:asciiTheme="majorHAnsi" w:hAnsiTheme="majorHAnsi" w:cstheme="majorHAnsi"/>
               </w:rPr>
-              <w:t>May include minor formatting errors and/or includes minor errors in headings, paragraphing, spacing, or application of CRAP design principles.</w:t>
+              <w:t xml:space="preserve">Uses incorrect formatting, inadequate contrast between headings and text, large paragraphs, and/or inaccurate </w:t>
+            </w:r>
+            <w:r>
+              <w:rPr>
+                <w:rFonts w:asciiTheme="majorHAnsi" w:hAnsiTheme="majorHAnsi" w:cstheme="majorHAnsi"/>
+              </w:rPr>
+              <w:lastRenderedPageBreak/>
+              <w:t>spacing. Inconsistently applies CRAP design principles.</w:t>
             </w:r>
           </w:p>
         </w:tc>
         <w:tc>
           <w:tcPr>
-            <w:tcW w:w="1606" w:type="dxa"/>
+            <w:tcW w:w="1565" w:type="dxa"/>
           </w:tcPr>
           <w:p>
             <w:pPr>
@@ -3508,13 +2999,14 @@
               <w:rPr>
                 <w:rFonts w:asciiTheme="majorHAnsi" w:hAnsiTheme="majorHAnsi" w:cstheme="majorHAnsi"/>
               </w:rPr>
-              <w:t>5</w:t>
+              <w:lastRenderedPageBreak/>
+              <w:t>0</w:t>
             </w:r>
           </w:p>
         </w:tc>
         <w:tc>
           <w:tcPr>
-            <w:tcW w:w="1418" w:type="dxa"/>
+            <w:tcW w:w="1363" w:type="dxa"/>
           </w:tcPr>
           <w:p>
             <w:pPr>
@@ -3530,71 +3022,13 @@
                 <w:b/>
                 <w:bCs/>
               </w:rPr>
-              <w:t>Needs Work</w:t>
+              <w:t>Missing</w:t>
             </w:r>
           </w:p>
         </w:tc>
         <w:tc>
           <w:tcPr>
-            <w:tcW w:w="2029" w:type="dxa"/>
-          </w:tcPr>
-          <w:p>
-            <w:pPr>
-              <w:rPr>
-                <w:rFonts w:asciiTheme="majorHAnsi" w:hAnsiTheme="majorHAnsi" w:cstheme="majorHAnsi"/>
-              </w:rPr>
-            </w:pPr>
-            <w:r>
-              <w:rPr>
-                <w:rFonts w:asciiTheme="majorHAnsi" w:hAnsiTheme="majorHAnsi" w:cstheme="majorHAnsi"/>
-              </w:rPr>
-              <w:t>Uses incorrect formatting, inadequate contrast between headings and text, large paragraphs, and/or inaccurate spacing. Inconsistently applies CRAP design principles.</w:t>
-            </w:r>
-          </w:p>
-        </w:tc>
-        <w:tc>
-          <w:tcPr>
-            <w:tcW w:w="1606" w:type="dxa"/>
-          </w:tcPr>
-          <w:p>
-            <w:pPr>
-              <w:rPr>
-                <w:rFonts w:asciiTheme="majorHAnsi" w:hAnsiTheme="majorHAnsi" w:cstheme="majorHAnsi"/>
-              </w:rPr>
-            </w:pPr>
-            <w:r>
-              <w:rPr>
-                <w:rFonts w:asciiTheme="majorHAnsi" w:hAnsiTheme="majorHAnsi" w:cstheme="majorHAnsi"/>
-              </w:rPr>
-              <w:t>0</w:t>
-            </w:r>
-          </w:p>
-        </w:tc>
-        <w:tc>
-          <w:tcPr>
-            <w:tcW w:w="1418" w:type="dxa"/>
-          </w:tcPr>
-          <w:p>
-            <w:pPr>
-              <w:rPr>
-                <w:rFonts w:asciiTheme="majorHAnsi" w:hAnsiTheme="majorHAnsi" w:cstheme="majorHAnsi"/>
-                <w:b/>
-                <w:bCs/>
-              </w:rPr>
-            </w:pPr>
-            <w:r>
-              <w:rPr>
-                <w:rFonts w:asciiTheme="majorHAnsi" w:hAnsiTheme="majorHAnsi" w:cstheme="majorHAnsi"/>
-                <w:b/>
-                <w:bCs/>
-              </w:rPr>
-              <w:t>Missing</w:t>
-            </w:r>
-          </w:p>
-        </w:tc>
-        <w:tc>
-          <w:tcPr>
-            <w:tcW w:w="2029" w:type="dxa"/>
+            <w:tcW w:w="2046" w:type="dxa"/>
           </w:tcPr>
           <w:p>
             <w:pPr>
@@ -3614,7 +3048,7 @@
       <w:tr>
         <w:tc>
           <w:tcPr>
-            <w:tcW w:w="1972" w:type="dxa"/>
+            <w:tcW w:w="1989" w:type="dxa"/>
           </w:tcPr>
           <w:p>
             <w:pPr>
@@ -3632,7 +3066,7 @@
         </w:tc>
         <w:tc>
           <w:tcPr>
-            <w:tcW w:w="1892" w:type="dxa"/>
+            <w:tcW w:w="2012" w:type="dxa"/>
           </w:tcPr>
           <w:p>
             <w:pPr>
@@ -3650,7 +3084,7 @@
         </w:tc>
         <w:tc>
           <w:tcPr>
-            <w:tcW w:w="701" w:type="dxa"/>
+            <w:tcW w:w="713" w:type="dxa"/>
           </w:tcPr>
           <w:p>
             <w:pPr>
@@ -3668,7 +3102,7 @@
         </w:tc>
         <w:tc>
           <w:tcPr>
-            <w:tcW w:w="1606" w:type="dxa"/>
+            <w:tcW w:w="1537" w:type="dxa"/>
           </w:tcPr>
           <w:p>
             <w:pPr>
@@ -3680,13 +3114,13 @@
               <w:rPr>
                 <w:rFonts w:asciiTheme="majorHAnsi" w:hAnsiTheme="majorHAnsi" w:cstheme="majorHAnsi"/>
               </w:rPr>
-              <w:t>12</w:t>
+              <w:t>9</w:t>
             </w:r>
           </w:p>
         </w:tc>
         <w:tc>
           <w:tcPr>
-            <w:tcW w:w="1418" w:type="dxa"/>
+            <w:tcW w:w="1393" w:type="dxa"/>
           </w:tcPr>
           <w:p>
             <w:pPr>
@@ -3702,13 +3136,13 @@
                 <w:b/>
                 <w:bCs/>
               </w:rPr>
-              <w:t>Exceeds Expectations</w:t>
+              <w:t>Meets Expectations</w:t>
             </w:r>
           </w:p>
         </w:tc>
         <w:tc>
           <w:tcPr>
-            <w:tcW w:w="2413" w:type="dxa"/>
+            <w:tcW w:w="1981" w:type="dxa"/>
           </w:tcPr>
           <w:p>
             <w:pPr>
@@ -3720,13 +3154,25 @@
               <w:rPr>
                 <w:rFonts w:asciiTheme="majorHAnsi" w:hAnsiTheme="majorHAnsi" w:cstheme="majorHAnsi"/>
               </w:rPr>
-              <w:t>Is consistently objective, professional, and reader-friendly. Phrases sentences concisely and smoothly. Perfectly written for the audience.</w:t>
+              <w:t>Is objective, professional, and clear throughout. Effectively uses plain language</w:t>
+            </w:r>
+            <w:r>
+              <w:rPr>
+                <w:rFonts w:asciiTheme="majorHAnsi" w:hAnsiTheme="majorHAnsi" w:cstheme="majorHAnsi"/>
+              </w:rPr>
+              <w:t>, and tailors content for non-expert readers</w:t>
+            </w:r>
+            <w:r>
+              <w:rPr>
+                <w:rFonts w:asciiTheme="majorHAnsi" w:hAnsiTheme="majorHAnsi" w:cstheme="majorHAnsi"/>
+              </w:rPr>
+              <w:t>.</w:t>
             </w:r>
           </w:p>
         </w:tc>
         <w:tc>
           <w:tcPr>
-            <w:tcW w:w="1576" w:type="dxa"/>
+            <w:tcW w:w="1563" w:type="dxa"/>
           </w:tcPr>
           <w:p>
             <w:pPr>
@@ -3738,13 +3184,13 @@
               <w:rPr>
                 <w:rFonts w:asciiTheme="majorHAnsi" w:hAnsiTheme="majorHAnsi" w:cstheme="majorHAnsi"/>
               </w:rPr>
-              <w:t>10</w:t>
+              <w:t>7</w:t>
             </w:r>
           </w:p>
         </w:tc>
         <w:tc>
           <w:tcPr>
-            <w:tcW w:w="1389" w:type="dxa"/>
+            <w:tcW w:w="1403" w:type="dxa"/>
           </w:tcPr>
           <w:p>
             <w:pPr>
@@ -3760,13 +3206,13 @@
                 <w:b/>
                 <w:bCs/>
               </w:rPr>
-              <w:t>Meets Expectations</w:t>
+              <w:t>Almost There</w:t>
             </w:r>
           </w:p>
         </w:tc>
         <w:tc>
           <w:tcPr>
-            <w:tcW w:w="1991" w:type="dxa"/>
+            <w:tcW w:w="2015" w:type="dxa"/>
           </w:tcPr>
           <w:p>
             <w:pPr>
@@ -3778,25 +3224,13 @@
               <w:rPr>
                 <w:rFonts w:asciiTheme="majorHAnsi" w:hAnsiTheme="majorHAnsi" w:cstheme="majorHAnsi"/>
               </w:rPr>
-              <w:t>Is objective, professional, and clear throughout. Effectively uses plain language</w:t>
-            </w:r>
-            <w:r>
-              <w:rPr>
-                <w:rFonts w:asciiTheme="majorHAnsi" w:hAnsiTheme="majorHAnsi" w:cstheme="majorHAnsi"/>
-              </w:rPr>
-              <w:t>, and tailors content for non-expert readers</w:t>
-            </w:r>
-            <w:r>
-              <w:rPr>
-                <w:rFonts w:asciiTheme="majorHAnsi" w:hAnsiTheme="majorHAnsi" w:cstheme="majorHAnsi"/>
-              </w:rPr>
-              <w:t>.</w:t>
+              <w:t>Is mostly objective and professional but occasionally uses complicated, overly technical, wordy, and/or repetitive phrasing.</w:t>
             </w:r>
           </w:p>
         </w:tc>
         <w:tc>
           <w:tcPr>
-            <w:tcW w:w="1606" w:type="dxa"/>
+            <w:tcW w:w="1564" w:type="dxa"/>
           </w:tcPr>
           <w:p>
             <w:pPr>
@@ -3808,13 +3242,13 @@
               <w:rPr>
                 <w:rFonts w:asciiTheme="majorHAnsi" w:hAnsiTheme="majorHAnsi" w:cstheme="majorHAnsi"/>
               </w:rPr>
-              <w:t>7</w:t>
+              <w:t>5</w:t>
             </w:r>
           </w:p>
         </w:tc>
         <w:tc>
           <w:tcPr>
-            <w:tcW w:w="1418" w:type="dxa"/>
+            <w:tcW w:w="1515" w:type="dxa"/>
           </w:tcPr>
           <w:p>
             <w:pPr>
@@ -3830,13 +3264,13 @@
                 <w:b/>
                 <w:bCs/>
               </w:rPr>
-              <w:t>Almost There</w:t>
+              <w:t>Needs Work</w:t>
             </w:r>
           </w:p>
         </w:tc>
         <w:tc>
           <w:tcPr>
-            <w:tcW w:w="2029" w:type="dxa"/>
+            <w:tcW w:w="2014" w:type="dxa"/>
           </w:tcPr>
           <w:p>
             <w:pPr>
@@ -3848,13 +3282,13 @@
               <w:rPr>
                 <w:rFonts w:asciiTheme="majorHAnsi" w:hAnsiTheme="majorHAnsi" w:cstheme="majorHAnsi"/>
               </w:rPr>
-              <w:t>Is mostly objective and professional but occasionally uses complicated, overly technical, wordy, and/or repetitive phrasing.</w:t>
+              <w:t>Uses unprofessional tone and/or language that is too technical or confusing</w:t>
             </w:r>
           </w:p>
         </w:tc>
         <w:tc>
           <w:tcPr>
-            <w:tcW w:w="1606" w:type="dxa"/>
+            <w:tcW w:w="1565" w:type="dxa"/>
           </w:tcPr>
           <w:p>
             <w:pPr>
@@ -3866,13 +3300,13 @@
               <w:rPr>
                 <w:rFonts w:asciiTheme="majorHAnsi" w:hAnsiTheme="majorHAnsi" w:cstheme="majorHAnsi"/>
               </w:rPr>
-              <w:t>5</w:t>
+              <w:t>0</w:t>
             </w:r>
           </w:p>
         </w:tc>
         <w:tc>
           <w:tcPr>
-            <w:tcW w:w="1418" w:type="dxa"/>
+            <w:tcW w:w="1363" w:type="dxa"/>
           </w:tcPr>
           <w:p>
             <w:pPr>
@@ -3888,71 +3322,13 @@
                 <w:b/>
                 <w:bCs/>
               </w:rPr>
-              <w:t>Needs Work</w:t>
+              <w:t>Missing</w:t>
             </w:r>
           </w:p>
         </w:tc>
         <w:tc>
           <w:tcPr>
-            <w:tcW w:w="2029" w:type="dxa"/>
-          </w:tcPr>
-          <w:p>
-            <w:pPr>
-              <w:rPr>
-                <w:rFonts w:asciiTheme="majorHAnsi" w:hAnsiTheme="majorHAnsi" w:cstheme="majorHAnsi"/>
-              </w:rPr>
-            </w:pPr>
-            <w:r>
-              <w:rPr>
-                <w:rFonts w:asciiTheme="majorHAnsi" w:hAnsiTheme="majorHAnsi" w:cstheme="majorHAnsi"/>
-              </w:rPr>
-              <w:t>Uses unprofessional tone and/or language that is too technical or confusing</w:t>
-            </w:r>
-          </w:p>
-        </w:tc>
-        <w:tc>
-          <w:tcPr>
-            <w:tcW w:w="1606" w:type="dxa"/>
-          </w:tcPr>
-          <w:p>
-            <w:pPr>
-              <w:rPr>
-                <w:rFonts w:asciiTheme="majorHAnsi" w:hAnsiTheme="majorHAnsi" w:cstheme="majorHAnsi"/>
-              </w:rPr>
-            </w:pPr>
-            <w:r>
-              <w:rPr>
-                <w:rFonts w:asciiTheme="majorHAnsi" w:hAnsiTheme="majorHAnsi" w:cstheme="majorHAnsi"/>
-              </w:rPr>
-              <w:t>0</w:t>
-            </w:r>
-          </w:p>
-        </w:tc>
-        <w:tc>
-          <w:tcPr>
-            <w:tcW w:w="1418" w:type="dxa"/>
-          </w:tcPr>
-          <w:p>
-            <w:pPr>
-              <w:rPr>
-                <w:rFonts w:asciiTheme="majorHAnsi" w:hAnsiTheme="majorHAnsi" w:cstheme="majorHAnsi"/>
-                <w:b/>
-                <w:bCs/>
-              </w:rPr>
-            </w:pPr>
-            <w:r>
-              <w:rPr>
-                <w:rFonts w:asciiTheme="majorHAnsi" w:hAnsiTheme="majorHAnsi" w:cstheme="majorHAnsi"/>
-                <w:b/>
-                <w:bCs/>
-              </w:rPr>
-              <w:t>Missing</w:t>
-            </w:r>
-          </w:p>
-        </w:tc>
-        <w:tc>
-          <w:tcPr>
-            <w:tcW w:w="2029" w:type="dxa"/>
+            <w:tcW w:w="2046" w:type="dxa"/>
           </w:tcPr>
           <w:p>
             <w:pPr>
@@ -4608,6 +3984,92 @@
     </w:lvl>
   </w:abstractNum>
   <w:abstractNum w:abstractNumId="12" w15:restartNumberingAfterBreak="0">
+    <w:nsid w:val="221B1167"/>
+    <w:multiLevelType w:val="hybridMultilevel"/>
+    <w:tmpl w:val="AC3E412C"/>
+    <w:lvl w:ilvl="0" w:tplc="0409000F">
+      <w:start w:val="1"/>
+      <w:numFmt w:val="decimal"/>
+      <w:lvlText w:val="%1."/>
+      <w:lvlJc w:val="left"/>
+      <w:pPr>
+        <w:ind w:left="720" w:hanging="360"/>
+      </w:pPr>
+    </w:lvl>
+    <w:lvl w:ilvl="1" w:tplc="04090019" w:tentative="1">
+      <w:start w:val="1"/>
+      <w:numFmt w:val="lowerLetter"/>
+      <w:lvlText w:val="%2."/>
+      <w:lvlJc w:val="left"/>
+      <w:pPr>
+        <w:ind w:left="1440" w:hanging="360"/>
+      </w:pPr>
+    </w:lvl>
+    <w:lvl w:ilvl="2" w:tplc="0409001B" w:tentative="1">
+      <w:start w:val="1"/>
+      <w:numFmt w:val="lowerRoman"/>
+      <w:lvlText w:val="%3."/>
+      <w:lvlJc w:val="right"/>
+      <w:pPr>
+        <w:ind w:left="2160" w:hanging="180"/>
+      </w:pPr>
+    </w:lvl>
+    <w:lvl w:ilvl="3" w:tplc="0409000F" w:tentative="1">
+      <w:start w:val="1"/>
+      <w:numFmt w:val="decimal"/>
+      <w:lvlText w:val="%4."/>
+      <w:lvlJc w:val="left"/>
+      <w:pPr>
+        <w:ind w:left="2880" w:hanging="360"/>
+      </w:pPr>
+    </w:lvl>
+    <w:lvl w:ilvl="4" w:tplc="04090019" w:tentative="1">
+      <w:start w:val="1"/>
+      <w:numFmt w:val="lowerLetter"/>
+      <w:lvlText w:val="%5."/>
+      <w:lvlJc w:val="left"/>
+      <w:pPr>
+        <w:ind w:left="3600" w:hanging="360"/>
+      </w:pPr>
+    </w:lvl>
+    <w:lvl w:ilvl="5" w:tplc="0409001B" w:tentative="1">
+      <w:start w:val="1"/>
+      <w:numFmt w:val="lowerRoman"/>
+      <w:lvlText w:val="%6."/>
+      <w:lvlJc w:val="right"/>
+      <w:pPr>
+        <w:ind w:left="4320" w:hanging="180"/>
+      </w:pPr>
+    </w:lvl>
+    <w:lvl w:ilvl="6" w:tplc="0409000F" w:tentative="1">
+      <w:start w:val="1"/>
+      <w:numFmt w:val="decimal"/>
+      <w:lvlText w:val="%7."/>
+      <w:lvlJc w:val="left"/>
+      <w:pPr>
+        <w:ind w:left="5040" w:hanging="360"/>
+      </w:pPr>
+    </w:lvl>
+    <w:lvl w:ilvl="7" w:tplc="04090019" w:tentative="1">
+      <w:start w:val="1"/>
+      <w:numFmt w:val="lowerLetter"/>
+      <w:lvlText w:val="%8."/>
+      <w:lvlJc w:val="left"/>
+      <w:pPr>
+        <w:ind w:left="5760" w:hanging="360"/>
+      </w:pPr>
+    </w:lvl>
+    <w:lvl w:ilvl="8" w:tplc="0409001B" w:tentative="1">
+      <w:start w:val="1"/>
+      <w:numFmt w:val="lowerRoman"/>
+      <w:lvlText w:val="%9."/>
+      <w:lvlJc w:val="right"/>
+      <w:pPr>
+        <w:ind w:left="6480" w:hanging="180"/>
+      </w:pPr>
+    </w:lvl>
+  </w:abstractNum>
+  <w:abstractNum w:abstractNumId="13" w15:restartNumberingAfterBreak="0">
     <w:nsid w:val="28DB1696"/>
     <w:multiLevelType w:val="multilevel"/>
     <w:tmpl w:val="71A8A7FC"/>
@@ -4756,7 +4218,7 @@
       </w:rPr>
     </w:lvl>
   </w:abstractNum>
-  <w:abstractNum w:abstractNumId="13" w15:restartNumberingAfterBreak="0">
+  <w:abstractNum w:abstractNumId="14" w15:restartNumberingAfterBreak="0">
     <w:nsid w:val="2B603F28"/>
     <w:multiLevelType w:val="multilevel"/>
     <w:tmpl w:val="25C2C9E4"/>
@@ -4905,7 +4367,7 @@
       </w:rPr>
     </w:lvl>
   </w:abstractNum>
-  <w:abstractNum w:abstractNumId="14" w15:restartNumberingAfterBreak="0">
+  <w:abstractNum w:abstractNumId="15" w15:restartNumberingAfterBreak="0">
     <w:nsid w:val="2BEF1FEC"/>
     <w:multiLevelType w:val="multilevel"/>
     <w:tmpl w:val="C354165E"/>
@@ -5054,7 +4516,7 @@
       </w:rPr>
     </w:lvl>
   </w:abstractNum>
-  <w:abstractNum w:abstractNumId="15" w15:restartNumberingAfterBreak="0">
+  <w:abstractNum w:abstractNumId="16" w15:restartNumberingAfterBreak="0">
     <w:nsid w:val="31B41349"/>
     <w:multiLevelType w:val="multilevel"/>
     <w:tmpl w:val="29B43A7C"/>
@@ -5203,7 +4665,7 @@
       </w:rPr>
     </w:lvl>
   </w:abstractNum>
-  <w:abstractNum w:abstractNumId="16" w15:restartNumberingAfterBreak="0">
+  <w:abstractNum w:abstractNumId="17" w15:restartNumberingAfterBreak="0">
     <w:nsid w:val="35AB3003"/>
     <w:multiLevelType w:val="multilevel"/>
     <w:tmpl w:val="236E9320"/>
@@ -5320,7 +4782,7 @@
       </w:pPr>
     </w:lvl>
   </w:abstractNum>
-  <w:abstractNum w:abstractNumId="17" w15:restartNumberingAfterBreak="0">
+  <w:abstractNum w:abstractNumId="18" w15:restartNumberingAfterBreak="0">
     <w:nsid w:val="438D3185"/>
     <w:multiLevelType w:val="multilevel"/>
     <w:tmpl w:val="FB2C50D4"/>
@@ -5469,7 +4931,7 @@
       </w:rPr>
     </w:lvl>
   </w:abstractNum>
-  <w:abstractNum w:abstractNumId="18" w15:restartNumberingAfterBreak="0">
+  <w:abstractNum w:abstractNumId="19" w15:restartNumberingAfterBreak="0">
     <w:nsid w:val="569D0778"/>
     <w:multiLevelType w:val="multilevel"/>
     <w:tmpl w:val="64963E70"/>
@@ -5618,7 +5080,7 @@
       </w:rPr>
     </w:lvl>
   </w:abstractNum>
-  <w:abstractNum w:abstractNumId="19" w15:restartNumberingAfterBreak="0">
+  <w:abstractNum w:abstractNumId="20" w15:restartNumberingAfterBreak="0">
     <w:nsid w:val="59B113D1"/>
     <w:multiLevelType w:val="multilevel"/>
     <w:tmpl w:val="E57A3936"/>
@@ -5767,7 +5229,7 @@
       </w:rPr>
     </w:lvl>
   </w:abstractNum>
-  <w:abstractNum w:abstractNumId="20" w15:restartNumberingAfterBreak="0">
+  <w:abstractNum w:abstractNumId="21" w15:restartNumberingAfterBreak="0">
     <w:nsid w:val="7D39581F"/>
     <w:multiLevelType w:val="multilevel"/>
     <w:tmpl w:val="CB10B3F2"/>
@@ -5944,40 +5406,43 @@
     <w:abstractNumId w:val="0"/>
   </w:num>
   <w:num w:numId="10" w16cid:durableId="140929843">
-    <w:abstractNumId w:val="15"/>
+    <w:abstractNumId w:val="16"/>
   </w:num>
   <w:num w:numId="11" w16cid:durableId="1257208312">
     <w:abstractNumId w:val="10"/>
   </w:num>
   <w:num w:numId="12" w16cid:durableId="457260410">
-    <w:abstractNumId w:val="19"/>
+    <w:abstractNumId w:val="20"/>
   </w:num>
   <w:num w:numId="13" w16cid:durableId="2039963640">
-    <w:abstractNumId w:val="20"/>
+    <w:abstractNumId w:val="21"/>
   </w:num>
   <w:num w:numId="14" w16cid:durableId="1855924584">
     <w:abstractNumId w:val="11"/>
   </w:num>
   <w:num w:numId="15" w16cid:durableId="1932080819">
-    <w:abstractNumId w:val="12"/>
+    <w:abstractNumId w:val="13"/>
   </w:num>
   <w:num w:numId="16" w16cid:durableId="236675959">
     <w:abstractNumId w:val="9"/>
   </w:num>
   <w:num w:numId="17" w16cid:durableId="1221281122">
+    <w:abstractNumId w:val="15"/>
+  </w:num>
+  <w:num w:numId="18" w16cid:durableId="1512571203">
+    <w:abstractNumId w:val="19"/>
+  </w:num>
+  <w:num w:numId="19" w16cid:durableId="406070736">
+    <w:abstractNumId w:val="18"/>
+  </w:num>
+  <w:num w:numId="20" w16cid:durableId="1749232192">
     <w:abstractNumId w:val="14"/>
   </w:num>
-  <w:num w:numId="18" w16cid:durableId="1512571203">
-    <w:abstractNumId w:val="18"/>
-  </w:num>
-  <w:num w:numId="19" w16cid:durableId="406070736">
+  <w:num w:numId="21" w16cid:durableId="1412039714">
     <w:abstractNumId w:val="17"/>
   </w:num>
-  <w:num w:numId="20" w16cid:durableId="1749232192">
-    <w:abstractNumId w:val="13"/>
-  </w:num>
-  <w:num w:numId="21" w16cid:durableId="1412039714">
-    <w:abstractNumId w:val="16"/>
+  <w:num w:numId="22" w16cid:durableId="802234780">
+    <w:abstractNumId w:val="12"/>
   </w:num>
 </w:numbering>
 </file>
@@ -6585,7 +6050,6 @@
   <w:style w:type="character" w:default="1" w:styleId="DefaultParagraphFont">
     <w:name w:val="Default Paragraph Font"/>
     <w:uiPriority w:val="1"/>
-    <w:semiHidden/>
     <w:unhideWhenUsed/>
   </w:style>
   <w:style w:type="table" w:default="1" w:styleId="TableNormal">

</xml_diff>